<commit_message>
Implementacion de capturas de pantalla interactivas
</commit_message>
<xml_diff>
--- a/manual_tiempos.docx
+++ b/manual_tiempos.docx
@@ -701,23 +701,7 @@
                 <w:color w:val="000000"/>
                 <w:sz w:val="18"/>
               </w:rPr>
-              <w:t>Registrar tiempos diarios de entrada y salida</w:t>
-            </w:r>
-            <w:r>
-              <w:rPr>
-                <w:rFonts w:ascii="Arial"/>
-                <w:color w:val="000000"/>
-                <w:sz w:val="18"/>
-              </w:rPr>
-              <w:t>, v</w:t>
-            </w:r>
-            <w:r>
-              <w:rPr>
-                <w:rFonts w:ascii="Arial"/>
-                <w:color w:val="000000"/>
-                <w:sz w:val="18"/>
-              </w:rPr>
-              <w:t>er reportes del equipo, aprobar o rechazar registros, agregar comentarios.</w:t>
+              <w:t>Registrar tiempos diarios de entrada y salida, ver reportes del equipo, aprobar o rechazar registros, agregar comentarios.</w:t>
             </w:r>
           </w:p>
         </w:tc>
@@ -999,6 +983,71 @@
     </w:p>
     <w:p>
       <w:pPr>
+        <w:spacing w:line="360" w:lineRule="auto"/>
+        <w:ind w:firstLine="119"/>
+      </w:pPr>
+    </w:p>
+    <w:p>
+      <w:pPr>
+        <w:spacing w:line="360" w:lineRule="auto"/>
+        <w:ind w:firstLine="342"/>
+      </w:pPr>
+      <w:r>
+        <w:rPr>
+          <w:noProof/>
+        </w:rPr>
+        <w:drawing>
+          <wp:inline distT="0" distB="0" distL="0" distR="0" wp14:anchorId="72DBD721" wp14:editId="36F7A2D6">
+            <wp:extent cx="6404610" cy="2526030"/>
+            <wp:effectExtent l="0" t="0" r="0" b="7620"/>
+            <wp:docPr id="614215136" name="Imagen 1"/>
+            <wp:cNvGraphicFramePr>
+              <a:graphicFrameLocks xmlns:a="http://schemas.openxmlformats.org/drawingml/2006/main" noChangeAspect="1"/>
+            </wp:cNvGraphicFramePr>
+            <a:graphic xmlns:a="http://schemas.openxmlformats.org/drawingml/2006/main">
+              <a:graphicData uri="http://schemas.openxmlformats.org/drawingml/2006/picture">
+                <pic:pic xmlns:pic="http://schemas.openxmlformats.org/drawingml/2006/picture">
+                  <pic:nvPicPr>
+                    <pic:cNvPr id="0" name="Picture 1"/>
+                    <pic:cNvPicPr>
+                      <a:picLocks noChangeAspect="1" noChangeArrowheads="1"/>
+                    </pic:cNvPicPr>
+                  </pic:nvPicPr>
+                  <pic:blipFill>
+                    <a:blip r:embed="rId9">
+                      <a:extLst>
+                        <a:ext uri="{28A0092B-C50C-407E-A947-70E740481C1C}">
+                          <a14:useLocalDpi xmlns:a14="http://schemas.microsoft.com/office/drawing/2010/main" val="0"/>
+                        </a:ext>
+                      </a:extLst>
+                    </a:blip>
+                    <a:srcRect/>
+                    <a:stretch>
+                      <a:fillRect/>
+                    </a:stretch>
+                  </pic:blipFill>
+                  <pic:spPr bwMode="auto">
+                    <a:xfrm>
+                      <a:off x="0" y="0"/>
+                      <a:ext cx="6404610" cy="2526030"/>
+                    </a:xfrm>
+                    <a:prstGeom prst="rect">
+                      <a:avLst/>
+                    </a:prstGeom>
+                    <a:noFill/>
+                    <a:ln>
+                      <a:noFill/>
+                    </a:ln>
+                  </pic:spPr>
+                </pic:pic>
+              </a:graphicData>
+            </a:graphic>
+          </wp:inline>
+        </w:drawing>
+      </w:r>
+    </w:p>
+    <w:p>
+      <w:pPr>
         <w:pStyle w:val="Textoindependiente"/>
       </w:pPr>
     </w:p>
@@ -1384,6 +1433,74 @@
     <w:p>
       <w:pPr>
         <w:pStyle w:val="Textoindependiente"/>
+        <w:spacing w:line="360" w:lineRule="auto"/>
+        <w:ind w:left="120" w:right="1132"/>
+      </w:pPr>
+      <w:r>
+        <w:rPr>
+          <w:noProof/>
+        </w:rPr>
+        <w:drawing>
+          <wp:anchor distT="0" distB="0" distL="114300" distR="114300" simplePos="0" relativeHeight="251659264" behindDoc="0" locked="0" layoutInCell="1" allowOverlap="1" wp14:anchorId="5B7CFF12" wp14:editId="65523D9D">
+            <wp:simplePos x="0" y="0"/>
+            <wp:positionH relativeFrom="margin">
+              <wp:posOffset>0</wp:posOffset>
+            </wp:positionH>
+            <wp:positionV relativeFrom="paragraph">
+              <wp:posOffset>223520</wp:posOffset>
+            </wp:positionV>
+            <wp:extent cx="6404610" cy="2480310"/>
+            <wp:effectExtent l="0" t="0" r="0" b="0"/>
+            <wp:wrapSquare wrapText="bothSides"/>
+            <wp:docPr id="324604205" name="Imagen 2"/>
+            <wp:cNvGraphicFramePr>
+              <a:graphicFrameLocks xmlns:a="http://schemas.openxmlformats.org/drawingml/2006/main" noChangeAspect="1"/>
+            </wp:cNvGraphicFramePr>
+            <a:graphic xmlns:a="http://schemas.openxmlformats.org/drawingml/2006/main">
+              <a:graphicData uri="http://schemas.openxmlformats.org/drawingml/2006/picture">
+                <pic:pic xmlns:pic="http://schemas.openxmlformats.org/drawingml/2006/picture">
+                  <pic:nvPicPr>
+                    <pic:cNvPr id="0" name="Picture 3"/>
+                    <pic:cNvPicPr>
+                      <a:picLocks noChangeAspect="1" noChangeArrowheads="1"/>
+                    </pic:cNvPicPr>
+                  </pic:nvPicPr>
+                  <pic:blipFill>
+                    <a:blip r:embed="rId10">
+                      <a:extLst>
+                        <a:ext uri="{28A0092B-C50C-407E-A947-70E740481C1C}">
+                          <a14:useLocalDpi xmlns:a14="http://schemas.microsoft.com/office/drawing/2010/main" val="0"/>
+                        </a:ext>
+                      </a:extLst>
+                    </a:blip>
+                    <a:srcRect/>
+                    <a:stretch>
+                      <a:fillRect/>
+                    </a:stretch>
+                  </pic:blipFill>
+                  <pic:spPr bwMode="auto">
+                    <a:xfrm>
+                      <a:off x="0" y="0"/>
+                      <a:ext cx="6404610" cy="2480310"/>
+                    </a:xfrm>
+                    <a:prstGeom prst="rect">
+                      <a:avLst/>
+                    </a:prstGeom>
+                    <a:noFill/>
+                    <a:ln>
+                      <a:noFill/>
+                    </a:ln>
+                  </pic:spPr>
+                </pic:pic>
+              </a:graphicData>
+            </a:graphic>
+          </wp:anchor>
+        </w:drawing>
+      </w:r>
+    </w:p>
+    <w:p>
+      <w:pPr>
+        <w:pStyle w:val="Textoindependiente"/>
         <w:spacing w:line="249" w:lineRule="auto"/>
         <w:ind w:right="1132"/>
         <w:rPr>
@@ -1394,8 +1511,23 @@
     <w:p>
       <w:pPr>
         <w:pStyle w:val="Textoindependiente"/>
-        <w:spacing w:before="121"/>
-      </w:pPr>
+        <w:spacing w:line="249" w:lineRule="auto"/>
+        <w:ind w:right="1132"/>
+        <w:rPr>
+          <w:szCs w:val="22"/>
+        </w:rPr>
+      </w:pPr>
+    </w:p>
+    <w:p>
+      <w:pPr>
+        <w:rPr>
+          <w:sz w:val="20"/>
+          <w:szCs w:val="20"/>
+        </w:rPr>
+      </w:pPr>
+      <w:r>
+        <w:br w:type="page"/>
+      </w:r>
     </w:p>
     <w:p>
       <w:pPr>
@@ -1406,6 +1538,7 @@
         <w:rPr>
           <w:color w:val="313B54"/>
         </w:rPr>
+        <w:lastRenderedPageBreak/>
         <w:t>Registros</w:t>
       </w:r>
     </w:p>
@@ -1539,136 +1672,43 @@
     <w:p>
       <w:pPr>
         <w:pStyle w:val="Textoindependiente"/>
-        <w:spacing w:before="121"/>
-      </w:pPr>
-    </w:p>
-    <w:p>
-      <w:pPr>
-        <w:pStyle w:val="Ttulo3"/>
-        <w:spacing w:line="360" w:lineRule="auto"/>
-        <w:jc w:val="both"/>
-        <w:rPr>
-          <w:sz w:val="20"/>
-          <w:szCs w:val="20"/>
-        </w:rPr>
-      </w:pPr>
-      <w:r>
-        <w:rPr>
-          <w:color w:val="313B54"/>
-          <w:sz w:val="20"/>
-          <w:szCs w:val="20"/>
-        </w:rPr>
-        <w:t xml:space="preserve">Registrar </w:t>
-      </w:r>
-      <w:r>
-        <w:rPr>
-          <w:color w:val="313B54"/>
-          <w:sz w:val="20"/>
-          <w:szCs w:val="20"/>
-        </w:rPr>
-        <w:t>de actividades</w:t>
-      </w:r>
-    </w:p>
-    <w:p>
-      <w:pPr>
-        <w:pStyle w:val="Prrafodelista"/>
-        <w:numPr>
-          <w:ilvl w:val="0"/>
-          <w:numId w:val="3"/>
-        </w:numPr>
-        <w:spacing w:line="360" w:lineRule="auto"/>
-      </w:pPr>
-      <w:r>
-        <w:rPr>
-          <w:sz w:val="20"/>
-        </w:rPr>
-        <w:t>Desde el panel principal, haz clic en el botón "</w:t>
-      </w:r>
-      <w:r>
+        <w:spacing w:line="360" w:lineRule="auto"/>
+        <w:ind w:left="479"/>
+        <w:rPr>
+          <w:spacing w:val="-2"/>
+          <w:lang w:val="es-419"/>
+        </w:rPr>
+      </w:pPr>
+    </w:p>
+    <w:p>
+      <w:pPr>
+        <w:ind w:firstLine="119"/>
         <w:rPr>
           <w:b/>
           <w:bCs/>
           <w:sz w:val="20"/>
-        </w:rPr>
-        <w:t xml:space="preserve">Agregar </w:t>
-      </w:r>
+          <w:szCs w:val="20"/>
+        </w:rPr>
+      </w:pPr>
       <w:r>
         <w:rPr>
           <w:b/>
           <w:bCs/>
-          <w:sz w:val="20"/>
-        </w:rPr>
-        <w:t>actividad</w:t>
-      </w:r>
-      <w:r>
-        <w:rPr>
-          <w:sz w:val="20"/>
-        </w:rPr>
-        <w:t>”.</w:t>
-      </w:r>
-    </w:p>
-    <w:p>
-      <w:pPr>
-        <w:pStyle w:val="Prrafodelista"/>
-        <w:numPr>
-          <w:ilvl w:val="0"/>
-          <w:numId w:val="3"/>
-        </w:numPr>
-        <w:spacing w:line="360" w:lineRule="auto"/>
-      </w:pPr>
-      <w:r>
-        <w:rPr>
-          <w:sz w:val="20"/>
-        </w:rPr>
-        <w:t xml:space="preserve">Se abrirá el formulario de registro. </w:t>
-      </w:r>
-      <w:r>
-        <w:rPr>
-          <w:sz w:val="20"/>
-        </w:rPr>
-        <w:t>Se establecerá la hora actual como la hora de inicio, automáticamente</w:t>
-      </w:r>
-      <w:r>
-        <w:rPr>
-          <w:sz w:val="20"/>
-        </w:rPr>
-        <w:t>.</w:t>
-      </w:r>
-    </w:p>
-    <w:p>
-      <w:pPr>
-        <w:pStyle w:val="Prrafodelista"/>
-        <w:numPr>
-          <w:ilvl w:val="0"/>
-          <w:numId w:val="3"/>
-        </w:numPr>
-        <w:spacing w:line="360" w:lineRule="auto"/>
-      </w:pPr>
-      <w:r>
-        <w:rPr>
-          <w:sz w:val="20"/>
-        </w:rPr>
-        <w:t>En el campo "</w:t>
+          <w:color w:val="313B54"/>
+          <w:sz w:val="20"/>
+          <w:szCs w:val="20"/>
+        </w:rPr>
+        <w:t xml:space="preserve">Registrar </w:t>
       </w:r>
       <w:r>
         <w:rPr>
           <w:b/>
           <w:bCs/>
-          <w:sz w:val="20"/>
-        </w:rPr>
-        <w:t>Hora fin</w:t>
-      </w:r>
-      <w:r>
-        <w:rPr>
-          <w:sz w:val="20"/>
-        </w:rPr>
-        <w:t>", ingresa el número de horas dedicadas</w:t>
-      </w:r>
-      <w:r>
-        <w:rPr>
-          <w:sz w:val="20"/>
-        </w:rPr>
-        <w:t>.</w:t>
+          <w:color w:val="313B54"/>
+          <w:sz w:val="20"/>
+          <w:szCs w:val="20"/>
+        </w:rPr>
+        <w:t>de actividades</w:t>
       </w:r>
     </w:p>
     <w:p>
@@ -1684,7 +1724,7 @@
         <w:rPr>
           <w:sz w:val="20"/>
         </w:rPr>
-        <w:t>En el campo "</w:t>
+        <w:t>Desde el panel principal, haz clic en el botón "</w:t>
       </w:r>
       <w:r>
         <w:rPr>
@@ -1692,29 +1732,7 @@
           <w:bCs/>
           <w:sz w:val="20"/>
         </w:rPr>
-        <w:t>Proyectos disponibles</w:t>
-      </w:r>
-      <w:r>
-        <w:rPr>
-          <w:sz w:val="20"/>
-        </w:rPr>
-        <w:t>", selecciona de la lista desplegable el proyecto al que corresponde el trabajo.</w:t>
-      </w:r>
-    </w:p>
-    <w:p>
-      <w:pPr>
-        <w:pStyle w:val="Prrafodelista"/>
-        <w:numPr>
-          <w:ilvl w:val="0"/>
-          <w:numId w:val="3"/>
-        </w:numPr>
-        <w:spacing w:line="360" w:lineRule="auto"/>
-      </w:pPr>
-      <w:r>
-        <w:rPr>
-          <w:sz w:val="20"/>
-        </w:rPr>
-        <w:t>En el campo “</w:t>
+        <w:t xml:space="preserve">Agregar </w:t>
       </w:r>
       <w:r>
         <w:rPr>
@@ -1722,7 +1740,57 @@
           <w:bCs/>
           <w:sz w:val="20"/>
         </w:rPr>
-        <w:t>jefe</w:t>
+        <w:t>actividad</w:t>
+      </w:r>
+      <w:r>
+        <w:rPr>
+          <w:sz w:val="20"/>
+        </w:rPr>
+        <w:t>”.</w:t>
+      </w:r>
+    </w:p>
+    <w:p>
+      <w:pPr>
+        <w:pStyle w:val="Prrafodelista"/>
+        <w:numPr>
+          <w:ilvl w:val="0"/>
+          <w:numId w:val="3"/>
+        </w:numPr>
+        <w:spacing w:line="360" w:lineRule="auto"/>
+      </w:pPr>
+      <w:r>
+        <w:rPr>
+          <w:sz w:val="20"/>
+        </w:rPr>
+        <w:t xml:space="preserve">Se abrirá el formulario de registro. </w:t>
+      </w:r>
+      <w:r>
+        <w:rPr>
+          <w:sz w:val="20"/>
+        </w:rPr>
+        <w:t>Se establecerá la hora actual como la hora de inicio, automáticamente</w:t>
+      </w:r>
+      <w:r>
+        <w:rPr>
+          <w:sz w:val="20"/>
+        </w:rPr>
+        <w:t>.</w:t>
+      </w:r>
+    </w:p>
+    <w:p>
+      <w:pPr>
+        <w:pStyle w:val="Prrafodelista"/>
+        <w:numPr>
+          <w:ilvl w:val="0"/>
+          <w:numId w:val="3"/>
+        </w:numPr>
+        <w:spacing w:line="360" w:lineRule="auto"/>
+      </w:pPr>
+      <w:r>
+        <w:rPr>
+          <w:sz w:val="20"/>
+        </w:rPr>
+        <w:t>En el campo "</w:t>
       </w:r>
       <w:r>
         <w:rPr>
@@ -1730,13 +1798,19 @@
           <w:bCs/>
           <w:sz w:val="20"/>
         </w:rPr>
-        <w:t xml:space="preserve"> responsable</w:t>
-      </w:r>
-      <w:r>
-        <w:rPr>
-          <w:sz w:val="20"/>
-        </w:rPr>
-        <w:t>”, selección a tu gerente encargado.</w:t>
+        <w:t>Hora fin</w:t>
+      </w:r>
+      <w:r>
+        <w:rPr>
+          <w:sz w:val="20"/>
+        </w:rPr>
+        <w:t>", ingresa el número de horas dedicadas</w:t>
+      </w:r>
+      <w:r>
+        <w:rPr>
+          <w:sz w:val="20"/>
+        </w:rPr>
+        <w:t>.</w:t>
       </w:r>
     </w:p>
     <w:p>
@@ -1752,7 +1826,7 @@
         <w:rPr>
           <w:sz w:val="20"/>
         </w:rPr>
-        <w:t>En el campo “</w:t>
+        <w:t>En el campo "</w:t>
       </w:r>
       <w:r>
         <w:rPr>
@@ -1760,13 +1834,13 @@
           <w:bCs/>
           <w:sz w:val="20"/>
         </w:rPr>
-        <w:t>Cliente</w:t>
-      </w:r>
-      <w:r>
-        <w:rPr>
-          <w:sz w:val="20"/>
-        </w:rPr>
-        <w:t>”, selecciona a quien será el cliente de la actividad.</w:t>
+        <w:t>Proyectos disponibles</w:t>
+      </w:r>
+      <w:r>
+        <w:rPr>
+          <w:sz w:val="20"/>
+        </w:rPr>
+        <w:t>", selecciona de la lista desplegable el proyecto al que corresponde el trabajo.</w:t>
       </w:r>
     </w:p>
     <w:p>
@@ -1782,7 +1856,7 @@
         <w:rPr>
           <w:sz w:val="20"/>
         </w:rPr>
-        <w:t>En el campo "</w:t>
+        <w:t>En el campo “</w:t>
       </w:r>
       <w:r>
         <w:rPr>
@@ -1790,29 +1864,7 @@
           <w:bCs/>
           <w:sz w:val="20"/>
         </w:rPr>
-        <w:t>Descripción libre</w:t>
-      </w:r>
-      <w:r>
-        <w:rPr>
-          <w:sz w:val="20"/>
-        </w:rPr>
-        <w:t>", escribe la descripción de la actividad realizada.</w:t>
-      </w:r>
-    </w:p>
-    <w:p>
-      <w:pPr>
-        <w:pStyle w:val="Prrafodelista"/>
-        <w:numPr>
-          <w:ilvl w:val="0"/>
-          <w:numId w:val="3"/>
-        </w:numPr>
-        <w:spacing w:line="360" w:lineRule="auto"/>
-      </w:pPr>
-      <w:r>
-        <w:rPr>
-          <w:sz w:val="20"/>
-        </w:rPr>
-        <w:t>Haz clic en "</w:t>
+        <w:t>jefe</w:t>
       </w:r>
       <w:r>
         <w:rPr>
@@ -1820,7 +1872,29 @@
           <w:bCs/>
           <w:sz w:val="20"/>
         </w:rPr>
-        <w:t>Guardar</w:t>
+        <w:t xml:space="preserve"> responsable</w:t>
+      </w:r>
+      <w:r>
+        <w:rPr>
+          <w:sz w:val="20"/>
+        </w:rPr>
+        <w:t>”, selección a tu gerente encargado.</w:t>
+      </w:r>
+    </w:p>
+    <w:p>
+      <w:pPr>
+        <w:pStyle w:val="Prrafodelista"/>
+        <w:numPr>
+          <w:ilvl w:val="0"/>
+          <w:numId w:val="3"/>
+        </w:numPr>
+        <w:spacing w:line="360" w:lineRule="auto"/>
+      </w:pPr>
+      <w:r>
+        <w:rPr>
+          <w:sz w:val="20"/>
+        </w:rPr>
+        <w:t>En el campo “</w:t>
       </w:r>
       <w:r>
         <w:rPr>
@@ -1828,6 +1902,74 @@
           <w:bCs/>
           <w:sz w:val="20"/>
         </w:rPr>
+        <w:t>Cliente</w:t>
+      </w:r>
+      <w:r>
+        <w:rPr>
+          <w:sz w:val="20"/>
+        </w:rPr>
+        <w:t>”, selecciona a quien será el cliente de la actividad.</w:t>
+      </w:r>
+    </w:p>
+    <w:p>
+      <w:pPr>
+        <w:pStyle w:val="Prrafodelista"/>
+        <w:numPr>
+          <w:ilvl w:val="0"/>
+          <w:numId w:val="3"/>
+        </w:numPr>
+        <w:spacing w:line="360" w:lineRule="auto"/>
+      </w:pPr>
+      <w:r>
+        <w:rPr>
+          <w:sz w:val="20"/>
+        </w:rPr>
+        <w:t>En el campo "</w:t>
+      </w:r>
+      <w:r>
+        <w:rPr>
+          <w:b/>
+          <w:bCs/>
+          <w:sz w:val="20"/>
+        </w:rPr>
+        <w:t>Descripción libre</w:t>
+      </w:r>
+      <w:r>
+        <w:rPr>
+          <w:sz w:val="20"/>
+        </w:rPr>
+        <w:t>", escribe la descripción de la actividad realizada.</w:t>
+      </w:r>
+    </w:p>
+    <w:p>
+      <w:pPr>
+        <w:pStyle w:val="Prrafodelista"/>
+        <w:numPr>
+          <w:ilvl w:val="0"/>
+          <w:numId w:val="3"/>
+        </w:numPr>
+        <w:spacing w:line="360" w:lineRule="auto"/>
+      </w:pPr>
+      <w:r>
+        <w:rPr>
+          <w:sz w:val="20"/>
+        </w:rPr>
+        <w:t>Haz clic en "</w:t>
+      </w:r>
+      <w:r>
+        <w:rPr>
+          <w:b/>
+          <w:bCs/>
+          <w:sz w:val="20"/>
+        </w:rPr>
+        <w:t>Guardar</w:t>
+      </w:r>
+      <w:r>
+        <w:rPr>
+          <w:b/>
+          <w:bCs/>
+          <w:sz w:val="20"/>
+        </w:rPr>
         <w:t xml:space="preserve"> actividad</w:t>
       </w:r>
       <w:r>
@@ -1835,6 +1977,65 @@
           <w:sz w:val="20"/>
         </w:rPr>
         <w:t>" para registrar la entrada. Aparecerá en tu tabla de tiempos.</w:t>
+      </w:r>
+    </w:p>
+    <w:p>
+      <w:pPr>
+        <w:pStyle w:val="Textoindependiente"/>
+        <w:spacing w:before="121"/>
+      </w:pPr>
+      <w:r>
+        <w:rPr>
+          <w:noProof/>
+        </w:rPr>
+        <w:drawing>
+          <wp:inline distT="0" distB="0" distL="0" distR="0" wp14:anchorId="11AE4447" wp14:editId="11EFC851">
+            <wp:extent cx="6404610" cy="3228340"/>
+            <wp:effectExtent l="0" t="0" r="0" b="0"/>
+            <wp:docPr id="262445015" name="Imagen 3"/>
+            <wp:cNvGraphicFramePr>
+              <a:graphicFrameLocks xmlns:a="http://schemas.openxmlformats.org/drawingml/2006/main" noChangeAspect="1"/>
+            </wp:cNvGraphicFramePr>
+            <a:graphic xmlns:a="http://schemas.openxmlformats.org/drawingml/2006/main">
+              <a:graphicData uri="http://schemas.openxmlformats.org/drawingml/2006/picture">
+                <pic:pic xmlns:pic="http://schemas.openxmlformats.org/drawingml/2006/picture">
+                  <pic:nvPicPr>
+                    <pic:cNvPr id="0" name="Picture 5"/>
+                    <pic:cNvPicPr>
+                      <a:picLocks noChangeAspect="1" noChangeArrowheads="1"/>
+                    </pic:cNvPicPr>
+                  </pic:nvPicPr>
+                  <pic:blipFill>
+                    <a:blip r:embed="rId11">
+                      <a:extLst>
+                        <a:ext uri="{28A0092B-C50C-407E-A947-70E740481C1C}">
+                          <a14:useLocalDpi xmlns:a14="http://schemas.microsoft.com/office/drawing/2010/main" val="0"/>
+                        </a:ext>
+                      </a:extLst>
+                    </a:blip>
+                    <a:srcRect/>
+                    <a:stretch>
+                      <a:fillRect/>
+                    </a:stretch>
+                  </pic:blipFill>
+                  <pic:spPr bwMode="auto">
+                    <a:xfrm>
+                      <a:off x="0" y="0"/>
+                      <a:ext cx="6404610" cy="3228340"/>
+                    </a:xfrm>
+                    <a:prstGeom prst="rect">
+                      <a:avLst/>
+                    </a:prstGeom>
+                    <a:noFill/>
+                    <a:ln>
+                      <a:noFill/>
+                    </a:ln>
+                  </pic:spPr>
+                </pic:pic>
+              </a:graphicData>
+            </a:graphic>
+          </wp:inline>
+        </w:drawing>
       </w:r>
     </w:p>
     <w:p>
@@ -2018,30 +2219,6 @@
     </w:p>
     <w:p>
       <w:pPr>
-        <w:rPr>
-          <w:sz w:val="20"/>
-          <w:szCs w:val="20"/>
-        </w:rPr>
-      </w:pPr>
-    </w:p>
-    <w:p>
-      <w:pPr>
-        <w:rPr>
-          <w:sz w:val="20"/>
-          <w:szCs w:val="20"/>
-        </w:rPr>
-      </w:pPr>
-    </w:p>
-    <w:p>
-      <w:pPr>
-        <w:rPr>
-          <w:sz w:val="20"/>
-          <w:szCs w:val="20"/>
-        </w:rPr>
-      </w:pPr>
-    </w:p>
-    <w:p>
-      <w:pPr>
         <w:pStyle w:val="Ttulo3"/>
         <w:jc w:val="both"/>
         <w:rPr>
@@ -2150,10 +2327,7 @@
         <w:spacing w:before="10" w:line="360" w:lineRule="auto"/>
       </w:pPr>
       <w:r>
-        <w:t>Se desplegará un calendario donde podrás seleccionar múltiples días.</w:t>
-      </w:r>
-      <w:r>
-        <w:t xml:space="preserve"> </w:t>
+        <w:t xml:space="preserve">Se desplegará un calendario donde podrás seleccionar múltiples días. </w:t>
       </w:r>
     </w:p>
     <w:p>
@@ -2190,6 +2364,71 @@
       </w:r>
       <w:r>
         <w:t>" para registrar los días seleccionados. Aparecerán en tu tabla de historial.</w:t>
+      </w:r>
+    </w:p>
+    <w:p>
+      <w:pPr>
+        <w:pStyle w:val="Textoindependiente"/>
+        <w:spacing w:before="10" w:line="360" w:lineRule="auto"/>
+      </w:pPr>
+    </w:p>
+    <w:p>
+      <w:pPr>
+        <w:pStyle w:val="Textoindependiente"/>
+        <w:spacing w:before="10" w:line="360" w:lineRule="auto"/>
+      </w:pPr>
+      <w:r>
+        <w:rPr>
+          <w:noProof/>
+        </w:rPr>
+        <w:drawing>
+          <wp:inline distT="0" distB="0" distL="0" distR="0" wp14:anchorId="060DE604" wp14:editId="0745D8AB">
+            <wp:extent cx="6404610" cy="2449830"/>
+            <wp:effectExtent l="0" t="0" r="0" b="7620"/>
+            <wp:docPr id="534949339" name="Imagen 4"/>
+            <wp:cNvGraphicFramePr>
+              <a:graphicFrameLocks xmlns:a="http://schemas.openxmlformats.org/drawingml/2006/main" noChangeAspect="1"/>
+            </wp:cNvGraphicFramePr>
+            <a:graphic xmlns:a="http://schemas.openxmlformats.org/drawingml/2006/main">
+              <a:graphicData uri="http://schemas.openxmlformats.org/drawingml/2006/picture">
+                <pic:pic xmlns:pic="http://schemas.openxmlformats.org/drawingml/2006/picture">
+                  <pic:nvPicPr>
+                    <pic:cNvPr id="0" name="Picture 7"/>
+                    <pic:cNvPicPr>
+                      <a:picLocks noChangeAspect="1" noChangeArrowheads="1"/>
+                    </pic:cNvPicPr>
+                  </pic:nvPicPr>
+                  <pic:blipFill>
+                    <a:blip r:embed="rId12">
+                      <a:extLst>
+                        <a:ext uri="{28A0092B-C50C-407E-A947-70E740481C1C}">
+                          <a14:useLocalDpi xmlns:a14="http://schemas.microsoft.com/office/drawing/2010/main" val="0"/>
+                        </a:ext>
+                      </a:extLst>
+                    </a:blip>
+                    <a:srcRect/>
+                    <a:stretch>
+                      <a:fillRect/>
+                    </a:stretch>
+                  </pic:blipFill>
+                  <pic:spPr bwMode="auto">
+                    <a:xfrm>
+                      <a:off x="0" y="0"/>
+                      <a:ext cx="6404610" cy="2449830"/>
+                    </a:xfrm>
+                    <a:prstGeom prst="rect">
+                      <a:avLst/>
+                    </a:prstGeom>
+                    <a:noFill/>
+                    <a:ln>
+                      <a:noFill/>
+                    </a:ln>
+                  </pic:spPr>
+                </pic:pic>
+              </a:graphicData>
+            </a:graphic>
+          </wp:inline>
+        </w:drawing>
       </w:r>
     </w:p>
     <w:p>
@@ -2206,30 +2445,50 @@
           <w:bCs/>
           <w:color w:val="375623"/>
         </w:rPr>
-        <w:t>Reco</w:t>
-      </w:r>
-      <w:r>
-        <w:rPr>
+        <w:t xml:space="preserve">Recordatorio: </w:t>
+      </w:r>
+      <w:r>
+        <w:rPr>
+          <w:i/>
+          <w:iCs/>
+        </w:rPr>
+        <w:t>Los registros de vacaciones y permisos requieren autorización previa del jefe a cargo.</w:t>
+      </w:r>
+    </w:p>
+    <w:p>
+      <w:pPr>
+        <w:pStyle w:val="Ttulo3"/>
+        <w:spacing w:before="240" w:line="360" w:lineRule="auto"/>
+        <w:ind w:left="0"/>
+        <w:jc w:val="both"/>
+        <w:rPr>
+          <w:color w:val="313B54"/>
+          <w:spacing w:val="-4"/>
+          <w:sz w:val="20"/>
+          <w:szCs w:val="20"/>
+        </w:rPr>
+      </w:pPr>
+    </w:p>
+    <w:p>
+      <w:pPr>
+        <w:rPr>
+          <w:rFonts w:ascii="Arial" w:eastAsia="Arial" w:hAnsi="Arial" w:cs="Arial"/>
           <w:b/>
           <w:bCs/>
-          <w:color w:val="375623"/>
-        </w:rPr>
-        <w:t>rdatorio</w:t>
-      </w:r>
-      <w:r>
-        <w:rPr>
-          <w:b/>
-          <w:bCs/>
-          <w:color w:val="375623"/>
-        </w:rPr>
-        <w:t xml:space="preserve">: </w:t>
-      </w:r>
-      <w:r>
-        <w:rPr>
-          <w:i/>
-          <w:iCs/>
-        </w:rPr>
-        <w:t>Los registros de vacaciones y permisos requieren autorización previa del jefe a cargo.</w:t>
+          <w:color w:val="313B54"/>
+          <w:spacing w:val="-4"/>
+          <w:sz w:val="20"/>
+          <w:szCs w:val="20"/>
+        </w:rPr>
+      </w:pPr>
+      <w:r>
+        <w:rPr>
+          <w:color w:val="313B54"/>
+          <w:spacing w:val="-4"/>
+          <w:sz w:val="20"/>
+          <w:szCs w:val="20"/>
+        </w:rPr>
+        <w:br w:type="page"/>
       </w:r>
     </w:p>
     <w:p>
@@ -2249,6 +2508,7 @@
           <w:sz w:val="20"/>
           <w:szCs w:val="20"/>
         </w:rPr>
+        <w:lastRenderedPageBreak/>
         <w:t xml:space="preserve">Registro </w:t>
       </w:r>
       <w:r>
@@ -2316,10 +2576,7 @@
         <w:t>Incapacidad</w:t>
       </w:r>
       <w:r>
-        <w:t>".</w:t>
-      </w:r>
-      <w:r>
-        <w:t xml:space="preserve"> </w:t>
+        <w:t xml:space="preserve">". </w:t>
       </w:r>
     </w:p>
     <w:p>
@@ -2332,10 +2589,7 @@
         <w:spacing w:before="10" w:line="360" w:lineRule="auto"/>
       </w:pPr>
       <w:r>
-        <w:t>Se desplegará un calendario donde podrás seleccionar múltiples días.</w:t>
-      </w:r>
-      <w:r>
-        <w:t xml:space="preserve"> </w:t>
+        <w:t xml:space="preserve">Se desplegará un calendario donde podrás seleccionar múltiples días. </w:t>
       </w:r>
     </w:p>
     <w:p>
@@ -2348,10 +2602,7 @@
         <w:spacing w:before="10" w:line="360" w:lineRule="auto"/>
       </w:pPr>
       <w:r>
-        <w:t>Agrega un comentario (opcional).</w:t>
-      </w:r>
-      <w:r>
-        <w:t xml:space="preserve"> </w:t>
+        <w:t xml:space="preserve">Agrega un comentario (opcional). </w:t>
       </w:r>
     </w:p>
     <w:p>
@@ -2388,6 +2639,71 @@
       </w:r>
       <w:r>
         <w:t>" para registrar los días seleccionados. Aparecerán en tu tabla de historial.</w:t>
+      </w:r>
+    </w:p>
+    <w:p>
+      <w:pPr>
+        <w:pStyle w:val="Textoindependiente"/>
+        <w:spacing w:before="10" w:line="360" w:lineRule="auto"/>
+      </w:pPr>
+    </w:p>
+    <w:p>
+      <w:pPr>
+        <w:pStyle w:val="Textoindependiente"/>
+        <w:spacing w:before="10" w:line="360" w:lineRule="auto"/>
+      </w:pPr>
+      <w:r>
+        <w:rPr>
+          <w:noProof/>
+        </w:rPr>
+        <w:drawing>
+          <wp:inline distT="0" distB="0" distL="0" distR="0" wp14:anchorId="3D2AD930" wp14:editId="067FB5F6">
+            <wp:extent cx="6404610" cy="4425315"/>
+            <wp:effectExtent l="0" t="0" r="0" b="0"/>
+            <wp:docPr id="749322926" name="Imagen 5"/>
+            <wp:cNvGraphicFramePr>
+              <a:graphicFrameLocks xmlns:a="http://schemas.openxmlformats.org/drawingml/2006/main" noChangeAspect="1"/>
+            </wp:cNvGraphicFramePr>
+            <a:graphic xmlns:a="http://schemas.openxmlformats.org/drawingml/2006/main">
+              <a:graphicData uri="http://schemas.openxmlformats.org/drawingml/2006/picture">
+                <pic:pic xmlns:pic="http://schemas.openxmlformats.org/drawingml/2006/picture">
+                  <pic:nvPicPr>
+                    <pic:cNvPr id="0" name="Picture 9"/>
+                    <pic:cNvPicPr>
+                      <a:picLocks noChangeAspect="1" noChangeArrowheads="1"/>
+                    </pic:cNvPicPr>
+                  </pic:nvPicPr>
+                  <pic:blipFill>
+                    <a:blip r:embed="rId13">
+                      <a:extLst>
+                        <a:ext uri="{28A0092B-C50C-407E-A947-70E740481C1C}">
+                          <a14:useLocalDpi xmlns:a14="http://schemas.microsoft.com/office/drawing/2010/main" val="0"/>
+                        </a:ext>
+                      </a:extLst>
+                    </a:blip>
+                    <a:srcRect/>
+                    <a:stretch>
+                      <a:fillRect/>
+                    </a:stretch>
+                  </pic:blipFill>
+                  <pic:spPr bwMode="auto">
+                    <a:xfrm>
+                      <a:off x="0" y="0"/>
+                      <a:ext cx="6404610" cy="4425315"/>
+                    </a:xfrm>
+                    <a:prstGeom prst="rect">
+                      <a:avLst/>
+                    </a:prstGeom>
+                    <a:noFill/>
+                    <a:ln>
+                      <a:noFill/>
+                    </a:ln>
+                  </pic:spPr>
+                </pic:pic>
+              </a:graphicData>
+            </a:graphic>
+          </wp:inline>
+        </w:drawing>
       </w:r>
     </w:p>
     <w:p>
@@ -2404,15 +2720,7 @@
           <w:bCs/>
           <w:color w:val="375623"/>
         </w:rPr>
-        <w:t>Re</w:t>
-      </w:r>
-      <w:r>
-        <w:rPr>
-          <w:b/>
-          <w:bCs/>
-          <w:color w:val="375623"/>
-        </w:rPr>
-        <w:t xml:space="preserve">cordatorio: </w:t>
+        <w:t xml:space="preserve">Recordatorio: </w:t>
       </w:r>
       <w:r>
         <w:rPr>
@@ -2438,6 +2746,89 @@
     </w:p>
     <w:p>
       <w:pPr>
+        <w:rPr>
+          <w:sz w:val="20"/>
+          <w:szCs w:val="20"/>
+        </w:rPr>
+      </w:pPr>
+      <w:r>
+        <w:br w:type="page"/>
+      </w:r>
+    </w:p>
+    <w:p>
+      <w:pPr>
+        <w:pStyle w:val="Ttulo3"/>
+        <w:jc w:val="both"/>
+      </w:pPr>
+      <w:r>
+        <w:rPr>
+          <w:color w:val="313B54"/>
+          <w:spacing w:val="-4"/>
+        </w:rPr>
+        <w:lastRenderedPageBreak/>
+        <w:t>Registros extemporáneos</w:t>
+      </w:r>
+    </w:p>
+    <w:p>
+      <w:pPr>
+        <w:pStyle w:val="Textoindependiente"/>
+        <w:numPr>
+          <w:ilvl w:val="0"/>
+          <w:numId w:val="19"/>
+        </w:numPr>
+        <w:spacing w:before="240" w:line="360" w:lineRule="auto"/>
+      </w:pPr>
+      <w:r>
+        <w:t>Permite registrar jornadas pasadas no capturadas previamente.</w:t>
+      </w:r>
+    </w:p>
+    <w:p>
+      <w:pPr>
+        <w:pStyle w:val="Textoindependiente"/>
+        <w:numPr>
+          <w:ilvl w:val="0"/>
+          <w:numId w:val="19"/>
+        </w:numPr>
+        <w:spacing w:line="360" w:lineRule="auto"/>
+      </w:pPr>
+      <w:r>
+        <w:t>Solo se pueden seleccionar días sin registro</w:t>
+      </w:r>
+      <w:r>
+        <w:t>s previos</w:t>
+      </w:r>
+      <w:r>
+        <w:t>.</w:t>
+      </w:r>
+    </w:p>
+    <w:p>
+      <w:pPr>
+        <w:pStyle w:val="Textoindependiente"/>
+        <w:numPr>
+          <w:ilvl w:val="0"/>
+          <w:numId w:val="19"/>
+        </w:numPr>
+        <w:spacing w:line="360" w:lineRule="auto"/>
+      </w:pPr>
+      <w:r>
+        <w:t>El usuario define manualmente la hora de entrada.</w:t>
+      </w:r>
+    </w:p>
+    <w:p>
+      <w:pPr>
+        <w:pStyle w:val="Textoindependiente"/>
+        <w:numPr>
+          <w:ilvl w:val="0"/>
+          <w:numId w:val="19"/>
+        </w:numPr>
+        <w:spacing w:line="360" w:lineRule="auto"/>
+      </w:pPr>
+      <w:r>
+        <w:t>Posteriormente puede registrar actividades como en un registro normal.</w:t>
+      </w:r>
+    </w:p>
+    <w:p>
+      <w:pPr>
         <w:pStyle w:val="Textoindependiente"/>
         <w:spacing w:before="10"/>
         <w:ind w:left="120"/>
@@ -2445,308 +2836,62 @@
     </w:p>
     <w:p>
       <w:pPr>
-        <w:pStyle w:val="Ttulo3"/>
-        <w:jc w:val="both"/>
-      </w:pPr>
-      <w:r>
-        <w:rPr>
-          <w:color w:val="313B54"/>
-          <w:spacing w:val="-4"/>
-        </w:rPr>
-        <w:t>Registros extemporáneos</w:t>
-      </w:r>
-    </w:p>
-    <w:p>
-      <w:pPr>
-        <w:pStyle w:val="Textoindependiente"/>
-        <w:numPr>
-          <w:ilvl w:val="0"/>
-          <w:numId w:val="19"/>
-        </w:numPr>
-        <w:spacing w:before="240" w:line="360" w:lineRule="auto"/>
-      </w:pPr>
-      <w:r>
-        <w:t>Permite registrar jornadas pasadas no capturadas previamente.</w:t>
-      </w:r>
-    </w:p>
-    <w:p>
-      <w:pPr>
-        <w:pStyle w:val="Textoindependiente"/>
-        <w:numPr>
-          <w:ilvl w:val="0"/>
-          <w:numId w:val="19"/>
-        </w:numPr>
-        <w:spacing w:line="360" w:lineRule="auto"/>
-      </w:pPr>
-      <w:r>
-        <w:t>Solo se pueden seleccionar días sin registro</w:t>
-      </w:r>
-      <w:r>
-        <w:t>s previos</w:t>
-      </w:r>
-      <w:r>
-        <w:t>.</w:t>
-      </w:r>
-    </w:p>
-    <w:p>
-      <w:pPr>
-        <w:pStyle w:val="Textoindependiente"/>
-        <w:numPr>
-          <w:ilvl w:val="0"/>
-          <w:numId w:val="19"/>
-        </w:numPr>
-        <w:spacing w:line="360" w:lineRule="auto"/>
-      </w:pPr>
-      <w:r>
-        <w:t>El usuario define manualmente la hora de entrada.</w:t>
-      </w:r>
-    </w:p>
-    <w:p>
-      <w:pPr>
-        <w:pStyle w:val="Textoindependiente"/>
-        <w:numPr>
-          <w:ilvl w:val="0"/>
-          <w:numId w:val="19"/>
-        </w:numPr>
-        <w:spacing w:line="360" w:lineRule="auto"/>
-      </w:pPr>
-      <w:r>
-        <w:t>Posteriormente puede registrar actividades como en un registro normal.</w:t>
-      </w:r>
-    </w:p>
-    <w:p>
-      <w:pPr>
         <w:pStyle w:val="Textoindependiente"/>
         <w:spacing w:before="10"/>
         <w:ind w:left="120"/>
       </w:pPr>
-    </w:p>
-    <w:p>
-      <w:pPr>
-        <w:pStyle w:val="Ttulo3"/>
-        <w:spacing w:line="360" w:lineRule="auto"/>
-        <w:jc w:val="both"/>
-        <w:rPr>
-          <w:sz w:val="20"/>
-          <w:szCs w:val="20"/>
-        </w:rPr>
-      </w:pPr>
-      <w:r>
-        <w:rPr>
-          <w:color w:val="313B54"/>
-          <w:spacing w:val="-4"/>
-          <w:sz w:val="20"/>
-          <w:szCs w:val="20"/>
-        </w:rPr>
-        <w:t>C</w:t>
-      </w:r>
-      <w:r>
-        <w:rPr>
-          <w:color w:val="313B54"/>
-          <w:spacing w:val="-4"/>
-          <w:sz w:val="20"/>
-          <w:szCs w:val="20"/>
-        </w:rPr>
-        <w:t>alendario</w:t>
-      </w:r>
-    </w:p>
-    <w:p>
-      <w:pPr>
-        <w:pStyle w:val="Textoindependiente"/>
-        <w:numPr>
-          <w:ilvl w:val="0"/>
-          <w:numId w:val="17"/>
-        </w:numPr>
-        <w:spacing w:line="360" w:lineRule="auto"/>
-      </w:pPr>
-      <w:r>
-        <w:t>El sistema proporciona un calendario interactivo.</w:t>
-      </w:r>
-    </w:p>
-    <w:p>
-      <w:pPr>
-        <w:pStyle w:val="Textoindependiente"/>
-        <w:numPr>
-          <w:ilvl w:val="0"/>
-          <w:numId w:val="17"/>
-        </w:numPr>
-        <w:spacing w:before="10" w:line="360" w:lineRule="auto"/>
-      </w:pPr>
-      <w:r>
-        <w:t>Permite seleccionar fechas en cualquier mes del año.</w:t>
-      </w:r>
-    </w:p>
-    <w:p>
-      <w:pPr>
-        <w:pStyle w:val="Textoindependiente"/>
-        <w:numPr>
-          <w:ilvl w:val="0"/>
-          <w:numId w:val="17"/>
-        </w:numPr>
-        <w:spacing w:before="10" w:line="360" w:lineRule="auto"/>
-      </w:pPr>
-      <w:r>
-        <w:t>Se puede agregar un comentario opcional para cada registro.</w:t>
-      </w:r>
-    </w:p>
-    <w:p>
-      <w:pPr>
-        <w:pStyle w:val="Textoindependiente"/>
-        <w:spacing w:before="10"/>
-        <w:ind w:left="120"/>
-      </w:pPr>
-    </w:p>
-    <w:p>
-      <w:pPr>
-        <w:pStyle w:val="Textoindependiente"/>
-        <w:spacing w:before="10"/>
-        <w:ind w:left="120"/>
-      </w:pPr>
-    </w:p>
-    <w:p>
-      <w:pPr>
-        <w:pStyle w:val="Textoindependiente"/>
-        <w:spacing w:before="10"/>
-        <w:ind w:left="120"/>
-      </w:pPr>
-    </w:p>
-    <w:p>
-      <w:pPr>
-        <w:pStyle w:val="Textoindependiente"/>
-        <w:spacing w:before="10"/>
-        <w:ind w:left="120"/>
-      </w:pPr>
-    </w:p>
-    <w:p>
-      <w:pPr>
-        <w:pStyle w:val="Textoindependiente"/>
-        <w:spacing w:before="10"/>
-        <w:ind w:left="120"/>
-      </w:pPr>
-    </w:p>
-    <w:p>
-      <w:pPr>
-        <w:pStyle w:val="Textoindependiente"/>
-        <w:spacing w:before="10"/>
-        <w:ind w:left="120"/>
-      </w:pPr>
-    </w:p>
-    <w:p>
-      <w:pPr>
-        <w:pStyle w:val="Textoindependiente"/>
-        <w:spacing w:before="10"/>
-        <w:ind w:left="120"/>
-      </w:pPr>
-    </w:p>
-    <w:p>
-      <w:pPr>
-        <w:pStyle w:val="Textoindependiente"/>
-        <w:spacing w:before="10"/>
-        <w:ind w:left="120"/>
-      </w:pPr>
-    </w:p>
-    <w:p>
-      <w:pPr>
-        <w:pStyle w:val="Textoindependiente"/>
-        <w:spacing w:before="10"/>
-        <w:ind w:left="120"/>
-      </w:pPr>
-    </w:p>
-    <w:p>
-      <w:pPr>
-        <w:pStyle w:val="Textoindependiente"/>
-        <w:spacing w:before="10"/>
-        <w:ind w:left="120"/>
-      </w:pPr>
-    </w:p>
-    <w:p>
-      <w:pPr>
-        <w:pStyle w:val="Textoindependiente"/>
-        <w:spacing w:before="10"/>
-        <w:ind w:left="120"/>
-      </w:pPr>
-    </w:p>
-    <w:p>
-      <w:pPr>
-        <w:pStyle w:val="Textoindependiente"/>
-        <w:spacing w:before="10"/>
-        <w:ind w:left="120"/>
-      </w:pPr>
-    </w:p>
-    <w:p>
-      <w:pPr>
-        <w:pStyle w:val="Textoindependiente"/>
-        <w:spacing w:before="10"/>
-        <w:ind w:left="120"/>
-      </w:pPr>
-    </w:p>
-    <w:p>
-      <w:pPr>
-        <w:pStyle w:val="Textoindependiente"/>
-        <w:spacing w:before="10"/>
-        <w:ind w:left="120"/>
-      </w:pPr>
-    </w:p>
-    <w:p>
-      <w:pPr>
-        <w:pStyle w:val="Ttulo3"/>
-        <w:jc w:val="both"/>
-      </w:pPr>
-      <w:r>
-        <w:rPr>
-          <w:color w:val="313B54"/>
-          <w:spacing w:val="-4"/>
-        </w:rPr>
-        <w:lastRenderedPageBreak/>
-        <w:t>Historial de registros</w:t>
-      </w:r>
-      <w:r>
-        <w:t xml:space="preserve"> </w:t>
-      </w:r>
-    </w:p>
-    <w:p>
-      <w:pPr>
-        <w:pStyle w:val="Textoindependiente"/>
-        <w:numPr>
-          <w:ilvl w:val="0"/>
-          <w:numId w:val="18"/>
-        </w:numPr>
-        <w:spacing w:before="240" w:line="360" w:lineRule="auto"/>
-      </w:pPr>
-      <w:r>
-        <w:t>Se muestra un listado de registros realizados.</w:t>
-      </w:r>
-    </w:p>
-    <w:p>
-      <w:pPr>
-        <w:pStyle w:val="Textoindependiente"/>
-        <w:numPr>
-          <w:ilvl w:val="0"/>
-          <w:numId w:val="18"/>
-        </w:numPr>
-        <w:spacing w:line="360" w:lineRule="auto"/>
-      </w:pPr>
-      <w:r>
-        <w:t>Incluye tipo, fecha y comentarios.</w:t>
-      </w:r>
-    </w:p>
-    <w:p>
-      <w:pPr>
-        <w:pStyle w:val="Textoindependiente"/>
-        <w:numPr>
-          <w:ilvl w:val="0"/>
-          <w:numId w:val="18"/>
-        </w:numPr>
-        <w:spacing w:line="360" w:lineRule="auto"/>
-      </w:pPr>
-      <w:r>
-        <w:t>Permite consulta de registros previos</w:t>
-      </w:r>
-      <w:r>
-        <w:t xml:space="preserve"> del día seleccionado en el calendario</w:t>
-      </w:r>
-      <w:r>
-        <w:t>.</w:t>
+      <w:r>
+        <w:rPr>
+          <w:noProof/>
+        </w:rPr>
+        <w:drawing>
+          <wp:inline distT="0" distB="0" distL="0" distR="0" wp14:anchorId="05E57D0A" wp14:editId="0F6875EA">
+            <wp:extent cx="6404610" cy="2861945"/>
+            <wp:effectExtent l="0" t="0" r="0" b="0"/>
+            <wp:docPr id="145366764" name="Imagen 6"/>
+            <wp:cNvGraphicFramePr>
+              <a:graphicFrameLocks xmlns:a="http://schemas.openxmlformats.org/drawingml/2006/main" noChangeAspect="1"/>
+            </wp:cNvGraphicFramePr>
+            <a:graphic xmlns:a="http://schemas.openxmlformats.org/drawingml/2006/main">
+              <a:graphicData uri="http://schemas.openxmlformats.org/drawingml/2006/picture">
+                <pic:pic xmlns:pic="http://schemas.openxmlformats.org/drawingml/2006/picture">
+                  <pic:nvPicPr>
+                    <pic:cNvPr id="0" name="Picture 11"/>
+                    <pic:cNvPicPr>
+                      <a:picLocks noChangeAspect="1" noChangeArrowheads="1"/>
+                    </pic:cNvPicPr>
+                  </pic:nvPicPr>
+                  <pic:blipFill>
+                    <a:blip r:embed="rId14">
+                      <a:extLst>
+                        <a:ext uri="{28A0092B-C50C-407E-A947-70E740481C1C}">
+                          <a14:useLocalDpi xmlns:a14="http://schemas.microsoft.com/office/drawing/2010/main" val="0"/>
+                        </a:ext>
+                      </a:extLst>
+                    </a:blip>
+                    <a:srcRect/>
+                    <a:stretch>
+                      <a:fillRect/>
+                    </a:stretch>
+                  </pic:blipFill>
+                  <pic:spPr bwMode="auto">
+                    <a:xfrm>
+                      <a:off x="0" y="0"/>
+                      <a:ext cx="6404610" cy="2861945"/>
+                    </a:xfrm>
+                    <a:prstGeom prst="rect">
+                      <a:avLst/>
+                    </a:prstGeom>
+                    <a:noFill/>
+                    <a:ln>
+                      <a:noFill/>
+                    </a:ln>
+                  </pic:spPr>
+                </pic:pic>
+              </a:graphicData>
+            </a:graphic>
+          </wp:inline>
+        </w:drawing>
       </w:r>
     </w:p>
     <w:p>
@@ -2770,14 +2915,7 @@
           <w:i/>
           <w:iCs/>
         </w:rPr>
-        <w:t>Aq</w:t>
-      </w:r>
-      <w:r>
-        <w:rPr>
-          <w:i/>
-          <w:iCs/>
-        </w:rPr>
-        <w:t>uí puede visualizar el estado de todo el historial de registros (registros aprobados, rechazados o pendientes).</w:t>
+        <w:t>El sistema proporciona un calendario interactivo que permite seleccionar fechas solo del mes en curso. Se puede agregar un comentario opcional para cada registro.</w:t>
       </w:r>
     </w:p>
     <w:p>
@@ -2797,66 +2935,121 @@
           <w:color w:val="313B54"/>
           <w:spacing w:val="-4"/>
         </w:rPr>
-        <w:t>Reglas del sistema</w:t>
-      </w:r>
-    </w:p>
-    <w:p>
-      <w:pPr>
-        <w:pStyle w:val="Textoindependiente"/>
-        <w:numPr>
-          <w:ilvl w:val="0"/>
-          <w:numId w:val="20"/>
+        <w:t>Historial de registros</w:t>
+      </w:r>
+      <w:r>
+        <w:t xml:space="preserve"> </w:t>
+      </w:r>
+    </w:p>
+    <w:p>
+      <w:pPr>
+        <w:pStyle w:val="Textoindependiente"/>
+        <w:numPr>
+          <w:ilvl w:val="0"/>
+          <w:numId w:val="18"/>
         </w:numPr>
         <w:spacing w:before="240" w:line="360" w:lineRule="auto"/>
       </w:pPr>
       <w:r>
-        <w:t>La jornada laboral estándar es de 8 horas.</w:t>
-      </w:r>
-    </w:p>
-    <w:p>
-      <w:pPr>
-        <w:pStyle w:val="Textoindependiente"/>
-        <w:numPr>
-          <w:ilvl w:val="0"/>
-          <w:numId w:val="20"/>
-        </w:numPr>
-        <w:spacing w:line="360" w:lineRule="auto"/>
-      </w:pPr>
-      <w:r>
-        <w:t>No se pueden exceder las horas diarias permitidas.</w:t>
-      </w:r>
-    </w:p>
-    <w:p>
-      <w:pPr>
-        <w:pStyle w:val="Textoindependiente"/>
-        <w:numPr>
-          <w:ilvl w:val="0"/>
-          <w:numId w:val="20"/>
-        </w:numPr>
-        <w:spacing w:line="360" w:lineRule="auto"/>
-      </w:pPr>
-      <w:r>
-        <w:t>No se permite duplicidad de registros en la misma fecha.</w:t>
-      </w:r>
-    </w:p>
-    <w:p>
-      <w:pPr>
-        <w:pStyle w:val="Textoindependiente"/>
-        <w:numPr>
-          <w:ilvl w:val="0"/>
-          <w:numId w:val="20"/>
-        </w:numPr>
-        <w:spacing w:line="360" w:lineRule="auto"/>
-      </w:pPr>
-      <w:r>
-        <w:t>Los registros extemporáneos solo aplican para días sin registro.</w:t>
-      </w:r>
-    </w:p>
-    <w:p>
-      <w:pPr>
-        <w:pStyle w:val="Textoindependiente"/>
-        <w:spacing w:line="360" w:lineRule="auto"/>
-      </w:pPr>
+        <w:t>Se muestra un listado de registros realizados.</w:t>
+      </w:r>
+    </w:p>
+    <w:p>
+      <w:pPr>
+        <w:pStyle w:val="Textoindependiente"/>
+        <w:numPr>
+          <w:ilvl w:val="0"/>
+          <w:numId w:val="18"/>
+        </w:numPr>
+        <w:spacing w:line="360" w:lineRule="auto"/>
+      </w:pPr>
+      <w:r>
+        <w:t>Incluye tipo, fecha y comentarios.</w:t>
+      </w:r>
+    </w:p>
+    <w:p>
+      <w:pPr>
+        <w:pStyle w:val="Textoindependiente"/>
+        <w:numPr>
+          <w:ilvl w:val="0"/>
+          <w:numId w:val="18"/>
+        </w:numPr>
+        <w:spacing w:line="360" w:lineRule="auto"/>
+      </w:pPr>
+      <w:r>
+        <w:t>Permite consulta de registros previos</w:t>
+      </w:r>
+      <w:r>
+        <w:t xml:space="preserve"> del día seleccionado en el calendario</w:t>
+      </w:r>
+      <w:r>
+        <w:t>.</w:t>
+      </w:r>
+    </w:p>
+    <w:p>
+      <w:pPr>
+        <w:pStyle w:val="Textoindependiente"/>
+        <w:spacing w:line="360" w:lineRule="auto"/>
+      </w:pPr>
+    </w:p>
+    <w:p>
+      <w:pPr>
+        <w:pStyle w:val="Textoindependiente"/>
+        <w:spacing w:line="360" w:lineRule="auto"/>
+      </w:pPr>
+      <w:r>
+        <w:rPr>
+          <w:noProof/>
+        </w:rPr>
+        <w:drawing>
+          <wp:inline distT="0" distB="0" distL="0" distR="0" wp14:anchorId="7E313DF4" wp14:editId="73412E54">
+            <wp:extent cx="6404610" cy="2289175"/>
+            <wp:effectExtent l="0" t="0" r="0" b="0"/>
+            <wp:docPr id="2109718442" name="Imagen 7"/>
+            <wp:cNvGraphicFramePr>
+              <a:graphicFrameLocks xmlns:a="http://schemas.openxmlformats.org/drawingml/2006/main" noChangeAspect="1"/>
+            </wp:cNvGraphicFramePr>
+            <a:graphic xmlns:a="http://schemas.openxmlformats.org/drawingml/2006/main">
+              <a:graphicData uri="http://schemas.openxmlformats.org/drawingml/2006/picture">
+                <pic:pic xmlns:pic="http://schemas.openxmlformats.org/drawingml/2006/picture">
+                  <pic:nvPicPr>
+                    <pic:cNvPr id="0" name="Picture 13"/>
+                    <pic:cNvPicPr>
+                      <a:picLocks noChangeAspect="1" noChangeArrowheads="1"/>
+                    </pic:cNvPicPr>
+                  </pic:nvPicPr>
+                  <pic:blipFill>
+                    <a:blip r:embed="rId15">
+                      <a:extLst>
+                        <a:ext uri="{28A0092B-C50C-407E-A947-70E740481C1C}">
+                          <a14:useLocalDpi xmlns:a14="http://schemas.microsoft.com/office/drawing/2010/main" val="0"/>
+                        </a:ext>
+                      </a:extLst>
+                    </a:blip>
+                    <a:srcRect/>
+                    <a:stretch>
+                      <a:fillRect/>
+                    </a:stretch>
+                  </pic:blipFill>
+                  <pic:spPr bwMode="auto">
+                    <a:xfrm>
+                      <a:off x="0" y="0"/>
+                      <a:ext cx="6404610" cy="2289175"/>
+                    </a:xfrm>
+                    <a:prstGeom prst="rect">
+                      <a:avLst/>
+                    </a:prstGeom>
+                    <a:noFill/>
+                    <a:ln>
+                      <a:noFill/>
+                    </a:ln>
+                  </pic:spPr>
+                </pic:pic>
+              </a:graphicData>
+            </a:graphic>
+          </wp:inline>
+        </w:drawing>
+      </w:r>
     </w:p>
     <w:p>
       <w:pPr>
@@ -2865,10 +3058,6 @@
         <w:spacing w:before="100" w:after="100" w:line="247" w:lineRule="exact"/>
         <w:ind w:left="200" w:right="200"/>
         <w:jc w:val="both"/>
-        <w:rPr>
-          <w:i/>
-          <w:iCs/>
-        </w:rPr>
       </w:pPr>
       <w:r>
         <w:rPr>
@@ -2876,23 +3065,121 @@
           <w:bCs/>
           <w:color w:val="375623"/>
         </w:rPr>
-        <w:t>Reco</w:t>
-      </w:r>
+        <w:t xml:space="preserve">Recordatorio: </w:t>
+      </w:r>
+      <w:r>
+        <w:rPr>
+          <w:i/>
+          <w:iCs/>
+        </w:rPr>
+        <w:t>Aq</w:t>
+      </w:r>
+      <w:r>
+        <w:rPr>
+          <w:i/>
+          <w:iCs/>
+        </w:rPr>
+        <w:t>uí puede visualizar el estado de todo el historial de registros (registros aprobados, rechazados o pendientes).</w:t>
+      </w:r>
+    </w:p>
+    <w:p>
+      <w:pPr>
+        <w:pStyle w:val="Textoindependiente"/>
+        <w:spacing w:before="10"/>
+        <w:ind w:left="120"/>
+      </w:pPr>
+    </w:p>
+    <w:p>
+      <w:pPr>
+        <w:pStyle w:val="Ttulo3"/>
+        <w:jc w:val="both"/>
+      </w:pPr>
+      <w:r>
+        <w:rPr>
+          <w:color w:val="313B54"/>
+          <w:spacing w:val="-4"/>
+        </w:rPr>
+        <w:lastRenderedPageBreak/>
+        <w:t>Reglas del sistema</w:t>
+      </w:r>
+    </w:p>
+    <w:p>
+      <w:pPr>
+        <w:pStyle w:val="Textoindependiente"/>
+        <w:numPr>
+          <w:ilvl w:val="0"/>
+          <w:numId w:val="20"/>
+        </w:numPr>
+        <w:spacing w:before="240" w:line="360" w:lineRule="auto"/>
+      </w:pPr>
+      <w:r>
+        <w:t>La jornada laboral estándar es de 8 horas.</w:t>
+      </w:r>
+    </w:p>
+    <w:p>
+      <w:pPr>
+        <w:pStyle w:val="Textoindependiente"/>
+        <w:numPr>
+          <w:ilvl w:val="0"/>
+          <w:numId w:val="20"/>
+        </w:numPr>
+        <w:spacing w:line="360" w:lineRule="auto"/>
+      </w:pPr>
+      <w:r>
+        <w:t>No se pueden exceder las horas diarias permitidas.</w:t>
+      </w:r>
+    </w:p>
+    <w:p>
+      <w:pPr>
+        <w:pStyle w:val="Textoindependiente"/>
+        <w:numPr>
+          <w:ilvl w:val="0"/>
+          <w:numId w:val="20"/>
+        </w:numPr>
+        <w:spacing w:line="360" w:lineRule="auto"/>
+      </w:pPr>
+      <w:r>
+        <w:t>No se permite duplicidad de registros en la misma fecha.</w:t>
+      </w:r>
+    </w:p>
+    <w:p>
+      <w:pPr>
+        <w:pStyle w:val="Textoindependiente"/>
+        <w:numPr>
+          <w:ilvl w:val="0"/>
+          <w:numId w:val="20"/>
+        </w:numPr>
+        <w:spacing w:line="360" w:lineRule="auto"/>
+      </w:pPr>
+      <w:r>
+        <w:t>Los registros extemporáneos solo aplican para días sin registro.</w:t>
+      </w:r>
+    </w:p>
+    <w:p>
+      <w:pPr>
+        <w:pStyle w:val="Textoindependiente"/>
+        <w:spacing w:line="360" w:lineRule="auto"/>
+      </w:pPr>
+    </w:p>
+    <w:p>
+      <w:pPr>
+        <w:pStyle w:val="Textoindependiente"/>
+        <w:shd w:val="clear" w:color="auto" w:fill="E2EFDA"/>
+        <w:spacing w:before="100" w:after="100" w:line="247" w:lineRule="exact"/>
+        <w:ind w:left="200" w:right="200"/>
+        <w:jc w:val="both"/>
+        <w:rPr>
+          <w:i/>
+          <w:iCs/>
+        </w:rPr>
+      </w:pPr>
       <w:r>
         <w:rPr>
           <w:b/>
           <w:bCs/>
           <w:color w:val="375623"/>
         </w:rPr>
-        <w:t>mendación</w:t>
-      </w:r>
-      <w:r>
-        <w:rPr>
-          <w:b/>
-          <w:bCs/>
-          <w:color w:val="375623"/>
-        </w:rPr>
-        <w:t xml:space="preserve">: </w:t>
+        <w:t xml:space="preserve">Recomendación: </w:t>
       </w:r>
       <w:r>
         <w:rPr>
@@ -3099,10 +3386,7 @@
         <w:ind w:right="1132"/>
       </w:pPr>
       <w:r>
-        <w:t>Pestaña para gestionar los reportes pendientes o aprobados.</w:t>
-      </w:r>
-      <w:r>
-        <w:t xml:space="preserve"> </w:t>
+        <w:t xml:space="preserve">Pestaña para gestionar los reportes pendientes o aprobados. </w:t>
       </w:r>
     </w:p>
     <w:p>
@@ -3125,6 +3409,70 @@
         <w:spacing w:line="360" w:lineRule="auto"/>
         <w:ind w:right="1132"/>
       </w:pPr>
+      <w:r>
+        <w:rPr>
+          <w:noProof/>
+        </w:rPr>
+        <w:drawing>
+          <wp:inline distT="0" distB="0" distL="0" distR="0" wp14:anchorId="08532ABB" wp14:editId="682D0966">
+            <wp:extent cx="6404610" cy="2715260"/>
+            <wp:effectExtent l="0" t="0" r="0" b="8890"/>
+            <wp:docPr id="1816148823" name="Imagen 8"/>
+            <wp:cNvGraphicFramePr>
+              <a:graphicFrameLocks xmlns:a="http://schemas.openxmlformats.org/drawingml/2006/main" noChangeAspect="1"/>
+            </wp:cNvGraphicFramePr>
+            <a:graphic xmlns:a="http://schemas.openxmlformats.org/drawingml/2006/main">
+              <a:graphicData uri="http://schemas.openxmlformats.org/drawingml/2006/picture">
+                <pic:pic xmlns:pic="http://schemas.openxmlformats.org/drawingml/2006/picture">
+                  <pic:nvPicPr>
+                    <pic:cNvPr id="0" name="Picture 15"/>
+                    <pic:cNvPicPr>
+                      <a:picLocks noChangeAspect="1" noChangeArrowheads="1"/>
+                    </pic:cNvPicPr>
+                  </pic:nvPicPr>
+                  <pic:blipFill>
+                    <a:blip r:embed="rId16">
+                      <a:extLst>
+                        <a:ext uri="{28A0092B-C50C-407E-A947-70E740481C1C}">
+                          <a14:useLocalDpi xmlns:a14="http://schemas.microsoft.com/office/drawing/2010/main" val="0"/>
+                        </a:ext>
+                      </a:extLst>
+                    </a:blip>
+                    <a:srcRect/>
+                    <a:stretch>
+                      <a:fillRect/>
+                    </a:stretch>
+                  </pic:blipFill>
+                  <pic:spPr bwMode="auto">
+                    <a:xfrm>
+                      <a:off x="0" y="0"/>
+                      <a:ext cx="6404610" cy="2715260"/>
+                    </a:xfrm>
+                    <a:prstGeom prst="rect">
+                      <a:avLst/>
+                    </a:prstGeom>
+                    <a:noFill/>
+                    <a:ln>
+                      <a:noFill/>
+                    </a:ln>
+                  </pic:spPr>
+                </pic:pic>
+              </a:graphicData>
+            </a:graphic>
+          </wp:inline>
+        </w:drawing>
+      </w:r>
+    </w:p>
+    <w:p>
+      <w:pPr>
+        <w:rPr>
+          <w:sz w:val="20"/>
+          <w:szCs w:val="20"/>
+        </w:rPr>
+      </w:pPr>
+      <w:r>
+        <w:br w:type="page"/>
+      </w:r>
     </w:p>
     <w:p>
       <w:pPr>
@@ -3135,6 +3483,7 @@
         <w:rPr>
           <w:color w:val="313B54"/>
         </w:rPr>
+        <w:lastRenderedPageBreak/>
         <w:t>Registros</w:t>
       </w:r>
     </w:p>
@@ -3270,6 +3619,65 @@
         <w:pStyle w:val="Textoindependiente"/>
         <w:spacing w:before="121"/>
       </w:pPr>
+      <w:r>
+        <w:rPr>
+          <w:noProof/>
+        </w:rPr>
+        <w:drawing>
+          <wp:inline distT="0" distB="0" distL="0" distR="0" wp14:anchorId="29D4BE75" wp14:editId="64FCB46A">
+            <wp:extent cx="6404610" cy="3228340"/>
+            <wp:effectExtent l="0" t="0" r="0" b="0"/>
+            <wp:docPr id="880311992" name="Imagen 3"/>
+            <wp:cNvGraphicFramePr>
+              <a:graphicFrameLocks xmlns:a="http://schemas.openxmlformats.org/drawingml/2006/main" noChangeAspect="1"/>
+            </wp:cNvGraphicFramePr>
+            <a:graphic xmlns:a="http://schemas.openxmlformats.org/drawingml/2006/main">
+              <a:graphicData uri="http://schemas.openxmlformats.org/drawingml/2006/picture">
+                <pic:pic xmlns:pic="http://schemas.openxmlformats.org/drawingml/2006/picture">
+                  <pic:nvPicPr>
+                    <pic:cNvPr id="0" name="Picture 5"/>
+                    <pic:cNvPicPr>
+                      <a:picLocks noChangeAspect="1" noChangeArrowheads="1"/>
+                    </pic:cNvPicPr>
+                  </pic:nvPicPr>
+                  <pic:blipFill>
+                    <a:blip r:embed="rId11">
+                      <a:extLst>
+                        <a:ext uri="{28A0092B-C50C-407E-A947-70E740481C1C}">
+                          <a14:useLocalDpi xmlns:a14="http://schemas.microsoft.com/office/drawing/2010/main" val="0"/>
+                        </a:ext>
+                      </a:extLst>
+                    </a:blip>
+                    <a:srcRect/>
+                    <a:stretch>
+                      <a:fillRect/>
+                    </a:stretch>
+                  </pic:blipFill>
+                  <pic:spPr bwMode="auto">
+                    <a:xfrm>
+                      <a:off x="0" y="0"/>
+                      <a:ext cx="6404610" cy="3228340"/>
+                    </a:xfrm>
+                    <a:prstGeom prst="rect">
+                      <a:avLst/>
+                    </a:prstGeom>
+                    <a:noFill/>
+                    <a:ln>
+                      <a:noFill/>
+                    </a:ln>
+                  </pic:spPr>
+                </pic:pic>
+              </a:graphicData>
+            </a:graphic>
+          </wp:inline>
+        </w:drawing>
+      </w:r>
+    </w:p>
+    <w:p>
+      <w:pPr>
+        <w:pStyle w:val="Textoindependiente"/>
+        <w:spacing w:before="121"/>
+      </w:pPr>
     </w:p>
     <w:p>
       <w:pPr>
@@ -3665,30 +4073,6 @@
     </w:p>
     <w:p>
       <w:pPr>
-        <w:rPr>
-          <w:sz w:val="20"/>
-          <w:szCs w:val="20"/>
-        </w:rPr>
-      </w:pPr>
-    </w:p>
-    <w:p>
-      <w:pPr>
-        <w:rPr>
-          <w:sz w:val="20"/>
-          <w:szCs w:val="20"/>
-        </w:rPr>
-      </w:pPr>
-    </w:p>
-    <w:p>
-      <w:pPr>
-        <w:rPr>
-          <w:sz w:val="20"/>
-          <w:szCs w:val="20"/>
-        </w:rPr>
-      </w:pPr>
-    </w:p>
-    <w:p>
-      <w:pPr>
         <w:pStyle w:val="Ttulo3"/>
         <w:jc w:val="both"/>
         <w:rPr>
@@ -3835,6 +4219,73 @@
       <w:r>
         <w:t>" para registrar los días seleccionados. Aparecerán en tu tabla de historial.</w:t>
       </w:r>
+    </w:p>
+    <w:p>
+      <w:pPr>
+        <w:pStyle w:val="Textoindependiente"/>
+        <w:spacing w:before="10" w:line="360" w:lineRule="auto"/>
+        <w:ind w:left="120"/>
+      </w:pPr>
+      <w:r>
+        <w:rPr>
+          <w:noProof/>
+        </w:rPr>
+        <w:drawing>
+          <wp:inline distT="0" distB="0" distL="0" distR="0" wp14:anchorId="18FE7119" wp14:editId="62DD7F7F">
+            <wp:extent cx="6404610" cy="2449830"/>
+            <wp:effectExtent l="0" t="0" r="0" b="7620"/>
+            <wp:docPr id="58506357" name="Imagen 4"/>
+            <wp:cNvGraphicFramePr>
+              <a:graphicFrameLocks xmlns:a="http://schemas.openxmlformats.org/drawingml/2006/main" noChangeAspect="1"/>
+            </wp:cNvGraphicFramePr>
+            <a:graphic xmlns:a="http://schemas.openxmlformats.org/drawingml/2006/main">
+              <a:graphicData uri="http://schemas.openxmlformats.org/drawingml/2006/picture">
+                <pic:pic xmlns:pic="http://schemas.openxmlformats.org/drawingml/2006/picture">
+                  <pic:nvPicPr>
+                    <pic:cNvPr id="0" name="Picture 7"/>
+                    <pic:cNvPicPr>
+                      <a:picLocks noChangeAspect="1" noChangeArrowheads="1"/>
+                    </pic:cNvPicPr>
+                  </pic:nvPicPr>
+                  <pic:blipFill>
+                    <a:blip r:embed="rId12">
+                      <a:extLst>
+                        <a:ext uri="{28A0092B-C50C-407E-A947-70E740481C1C}">
+                          <a14:useLocalDpi xmlns:a14="http://schemas.microsoft.com/office/drawing/2010/main" val="0"/>
+                        </a:ext>
+                      </a:extLst>
+                    </a:blip>
+                    <a:srcRect/>
+                    <a:stretch>
+                      <a:fillRect/>
+                    </a:stretch>
+                  </pic:blipFill>
+                  <pic:spPr bwMode="auto">
+                    <a:xfrm>
+                      <a:off x="0" y="0"/>
+                      <a:ext cx="6404610" cy="2449830"/>
+                    </a:xfrm>
+                    <a:prstGeom prst="rect">
+                      <a:avLst/>
+                    </a:prstGeom>
+                    <a:noFill/>
+                    <a:ln>
+                      <a:noFill/>
+                    </a:ln>
+                  </pic:spPr>
+                </pic:pic>
+              </a:graphicData>
+            </a:graphic>
+          </wp:inline>
+        </w:drawing>
+      </w:r>
+    </w:p>
+    <w:p>
+      <w:pPr>
+        <w:pStyle w:val="Textoindependiente"/>
+        <w:spacing w:before="10" w:line="360" w:lineRule="auto"/>
+        <w:ind w:left="120"/>
+      </w:pPr>
     </w:p>
     <w:p>
       <w:pPr>
@@ -3843,6 +4294,10 @@
         <w:spacing w:before="100" w:after="100" w:line="247" w:lineRule="exact"/>
         <w:ind w:left="200" w:right="200"/>
         <w:jc w:val="both"/>
+        <w:rPr>
+          <w:i/>
+          <w:iCs/>
+        </w:rPr>
       </w:pPr>
       <w:r>
         <w:rPr>
@@ -3862,6 +4317,28 @@
     </w:p>
     <w:p>
       <w:pPr>
+        <w:rPr>
+          <w:rFonts w:ascii="Arial" w:eastAsia="Arial" w:hAnsi="Arial" w:cs="Arial"/>
+          <w:b/>
+          <w:bCs/>
+          <w:color w:val="313B54"/>
+          <w:spacing w:val="-4"/>
+          <w:sz w:val="20"/>
+          <w:szCs w:val="20"/>
+        </w:rPr>
+      </w:pPr>
+      <w:r>
+        <w:rPr>
+          <w:color w:val="313B54"/>
+          <w:spacing w:val="-4"/>
+          <w:sz w:val="20"/>
+          <w:szCs w:val="20"/>
+        </w:rPr>
+        <w:br w:type="page"/>
+      </w:r>
+    </w:p>
+    <w:p>
+      <w:pPr>
         <w:pStyle w:val="Ttulo3"/>
         <w:spacing w:before="240" w:line="360" w:lineRule="auto"/>
         <w:jc w:val="both"/>
@@ -3877,6 +4354,7 @@
           <w:sz w:val="20"/>
           <w:szCs w:val="20"/>
         </w:rPr>
+        <w:lastRenderedPageBreak/>
         <w:t xml:space="preserve">Registro </w:t>
       </w:r>
       <w:r>
@@ -3886,16 +4364,7 @@
           <w:sz w:val="20"/>
           <w:szCs w:val="20"/>
         </w:rPr>
-        <w:t xml:space="preserve">de </w:t>
-      </w:r>
-      <w:r>
-        <w:rPr>
-          <w:color w:val="313B54"/>
-          <w:spacing w:val="-4"/>
-          <w:sz w:val="20"/>
-          <w:szCs w:val="20"/>
-        </w:rPr>
-        <w:t>incapacidad</w:t>
+        <w:t>de incapacidad</w:t>
       </w:r>
     </w:p>
     <w:p>
@@ -4007,6 +4476,73 @@
       </w:r>
       <w:r>
         <w:t>" para registrar los días seleccionados. Aparecerán en tu tabla de historial.</w:t>
+      </w:r>
+    </w:p>
+    <w:p>
+      <w:pPr>
+        <w:pStyle w:val="Textoindependiente"/>
+        <w:spacing w:before="10" w:line="360" w:lineRule="auto"/>
+        <w:ind w:left="120"/>
+      </w:pPr>
+    </w:p>
+    <w:p>
+      <w:pPr>
+        <w:pStyle w:val="Textoindependiente"/>
+        <w:spacing w:before="10" w:line="360" w:lineRule="auto"/>
+        <w:ind w:left="120"/>
+      </w:pPr>
+      <w:r>
+        <w:rPr>
+          <w:noProof/>
+        </w:rPr>
+        <w:drawing>
+          <wp:inline distT="0" distB="0" distL="0" distR="0" wp14:anchorId="7541CB3F" wp14:editId="540BF0CE">
+            <wp:extent cx="6404610" cy="4425315"/>
+            <wp:effectExtent l="0" t="0" r="0" b="0"/>
+            <wp:docPr id="1312507286" name="Imagen 5"/>
+            <wp:cNvGraphicFramePr>
+              <a:graphicFrameLocks xmlns:a="http://schemas.openxmlformats.org/drawingml/2006/main" noChangeAspect="1"/>
+            </wp:cNvGraphicFramePr>
+            <a:graphic xmlns:a="http://schemas.openxmlformats.org/drawingml/2006/main">
+              <a:graphicData uri="http://schemas.openxmlformats.org/drawingml/2006/picture">
+                <pic:pic xmlns:pic="http://schemas.openxmlformats.org/drawingml/2006/picture">
+                  <pic:nvPicPr>
+                    <pic:cNvPr id="0" name="Picture 9"/>
+                    <pic:cNvPicPr>
+                      <a:picLocks noChangeAspect="1" noChangeArrowheads="1"/>
+                    </pic:cNvPicPr>
+                  </pic:nvPicPr>
+                  <pic:blipFill>
+                    <a:blip r:embed="rId13">
+                      <a:extLst>
+                        <a:ext uri="{28A0092B-C50C-407E-A947-70E740481C1C}">
+                          <a14:useLocalDpi xmlns:a14="http://schemas.microsoft.com/office/drawing/2010/main" val="0"/>
+                        </a:ext>
+                      </a:extLst>
+                    </a:blip>
+                    <a:srcRect/>
+                    <a:stretch>
+                      <a:fillRect/>
+                    </a:stretch>
+                  </pic:blipFill>
+                  <pic:spPr bwMode="auto">
+                    <a:xfrm>
+                      <a:off x="0" y="0"/>
+                      <a:ext cx="6404610" cy="4425315"/>
+                    </a:xfrm>
+                    <a:prstGeom prst="rect">
+                      <a:avLst/>
+                    </a:prstGeom>
+                    <a:noFill/>
+                    <a:ln>
+                      <a:noFill/>
+                    </a:ln>
+                  </pic:spPr>
+                </pic:pic>
+              </a:graphicData>
+            </a:graphic>
+          </wp:inline>
+        </w:drawing>
       </w:r>
     </w:p>
     <w:p>
@@ -4035,9 +4571,14 @@
     </w:p>
     <w:p>
       <w:pPr>
-        <w:pStyle w:val="Textoindependiente"/>
-        <w:spacing w:before="121"/>
-      </w:pPr>
+        <w:rPr>
+          <w:sz w:val="20"/>
+          <w:szCs w:val="20"/>
+        </w:rPr>
+      </w:pPr>
+      <w:r>
+        <w:br w:type="page"/>
+      </w:r>
     </w:p>
     <w:p>
       <w:pPr>
@@ -4049,6 +4590,7 @@
           <w:color w:val="313B54"/>
           <w:spacing w:val="-4"/>
         </w:rPr>
+        <w:lastRenderedPageBreak/>
         <w:t>Registros extemporáneos</w:t>
       </w:r>
     </w:p>
@@ -4107,83 +4649,72 @@
     <w:p>
       <w:pPr>
         <w:pStyle w:val="Textoindependiente"/>
-        <w:spacing w:before="10"/>
-        <w:ind w:left="120"/>
-      </w:pPr>
-    </w:p>
-    <w:p>
-      <w:pPr>
-        <w:pStyle w:val="Ttulo3"/>
-        <w:spacing w:line="360" w:lineRule="auto"/>
-        <w:jc w:val="both"/>
-        <w:rPr>
-          <w:sz w:val="20"/>
-          <w:szCs w:val="20"/>
-        </w:rPr>
-      </w:pPr>
-      <w:r>
-        <w:rPr>
-          <w:color w:val="313B54"/>
-          <w:spacing w:val="-4"/>
-          <w:sz w:val="20"/>
-          <w:szCs w:val="20"/>
-        </w:rPr>
-        <w:t>C</w:t>
-      </w:r>
-      <w:r>
-        <w:rPr>
-          <w:color w:val="313B54"/>
-          <w:spacing w:val="-4"/>
-          <w:sz w:val="20"/>
-          <w:szCs w:val="20"/>
-        </w:rPr>
-        <w:t>alendario</w:t>
-      </w:r>
-    </w:p>
-    <w:p>
-      <w:pPr>
-        <w:pStyle w:val="Textoindependiente"/>
-        <w:numPr>
-          <w:ilvl w:val="0"/>
-          <w:numId w:val="17"/>
-        </w:numPr>
-        <w:spacing w:line="360" w:lineRule="auto"/>
-      </w:pPr>
-      <w:r>
-        <w:t>El sistema proporciona un calendario interactivo.</w:t>
-      </w:r>
-    </w:p>
-    <w:p>
-      <w:pPr>
-        <w:pStyle w:val="Textoindependiente"/>
-        <w:numPr>
-          <w:ilvl w:val="0"/>
-          <w:numId w:val="17"/>
-        </w:numPr>
-        <w:spacing w:before="10" w:line="360" w:lineRule="auto"/>
-      </w:pPr>
-      <w:r>
-        <w:t>Permite seleccionar fechas en cualquier mes del año.</w:t>
-      </w:r>
-    </w:p>
-    <w:p>
-      <w:pPr>
-        <w:pStyle w:val="Textoindependiente"/>
-        <w:numPr>
-          <w:ilvl w:val="0"/>
-          <w:numId w:val="17"/>
-        </w:numPr>
-        <w:spacing w:before="10" w:line="360" w:lineRule="auto"/>
-      </w:pPr>
-      <w:r>
-        <w:t>Se puede agregar un comentario opcional para cada registro.</w:t>
-      </w:r>
-    </w:p>
-    <w:p>
-      <w:pPr>
-        <w:pStyle w:val="Textoindependiente"/>
         <w:spacing w:before="121"/>
       </w:pPr>
+      <w:r>
+        <w:rPr>
+          <w:noProof/>
+        </w:rPr>
+        <w:drawing>
+          <wp:inline distT="0" distB="0" distL="0" distR="0" wp14:anchorId="354362CC" wp14:editId="47B2A4FE">
+            <wp:extent cx="6404610" cy="2861945"/>
+            <wp:effectExtent l="0" t="0" r="0" b="0"/>
+            <wp:docPr id="1159625133" name="Imagen 6"/>
+            <wp:cNvGraphicFramePr>
+              <a:graphicFrameLocks xmlns:a="http://schemas.openxmlformats.org/drawingml/2006/main" noChangeAspect="1"/>
+            </wp:cNvGraphicFramePr>
+            <a:graphic xmlns:a="http://schemas.openxmlformats.org/drawingml/2006/main">
+              <a:graphicData uri="http://schemas.openxmlformats.org/drawingml/2006/picture">
+                <pic:pic xmlns:pic="http://schemas.openxmlformats.org/drawingml/2006/picture">
+                  <pic:nvPicPr>
+                    <pic:cNvPr id="0" name="Picture 11"/>
+                    <pic:cNvPicPr>
+                      <a:picLocks noChangeAspect="1" noChangeArrowheads="1"/>
+                    </pic:cNvPicPr>
+                  </pic:nvPicPr>
+                  <pic:blipFill>
+                    <a:blip r:embed="rId14">
+                      <a:extLst>
+                        <a:ext uri="{28A0092B-C50C-407E-A947-70E740481C1C}">
+                          <a14:useLocalDpi xmlns:a14="http://schemas.microsoft.com/office/drawing/2010/main" val="0"/>
+                        </a:ext>
+                      </a:extLst>
+                    </a:blip>
+                    <a:srcRect/>
+                    <a:stretch>
+                      <a:fillRect/>
+                    </a:stretch>
+                  </pic:blipFill>
+                  <pic:spPr bwMode="auto">
+                    <a:xfrm>
+                      <a:off x="0" y="0"/>
+                      <a:ext cx="6404610" cy="2861945"/>
+                    </a:xfrm>
+                    <a:prstGeom prst="rect">
+                      <a:avLst/>
+                    </a:prstGeom>
+                    <a:noFill/>
+                    <a:ln>
+                      <a:noFill/>
+                    </a:ln>
+                  </pic:spPr>
+                </pic:pic>
+              </a:graphicData>
+            </a:graphic>
+          </wp:inline>
+        </w:drawing>
+      </w:r>
+    </w:p>
+    <w:p>
+      <w:pPr>
+        <w:rPr>
+          <w:sz w:val="20"/>
+          <w:szCs w:val="20"/>
+        </w:rPr>
+      </w:pPr>
+      <w:r>
+        <w:br w:type="page"/>
+      </w:r>
     </w:p>
     <w:p>
       <w:pPr>
@@ -4194,6 +4725,7 @@
         <w:rPr>
           <w:color w:val="313B54"/>
         </w:rPr>
+        <w:lastRenderedPageBreak/>
         <w:t>Validar un Reporte</w:t>
       </w:r>
     </w:p>
@@ -4282,14 +4814,7 @@
           <w:sz w:val="20"/>
           <w:szCs w:val="20"/>
         </w:rPr>
-        <w:t>Confirma la acción en la ventana de confirmación.</w:t>
-      </w:r>
-      <w:r>
-        <w:rPr>
-          <w:sz w:val="20"/>
-          <w:szCs w:val="20"/>
-        </w:rPr>
-        <w:t xml:space="preserve"> </w:t>
+        <w:t xml:space="preserve">Confirma la acción en la ventana de confirmación. </w:t>
       </w:r>
     </w:p>
     <w:p>
@@ -4310,14 +4835,7 @@
           <w:sz w:val="20"/>
           <w:szCs w:val="20"/>
         </w:rPr>
-        <w:t xml:space="preserve">El estado del reporte cambiará a </w:t>
-      </w:r>
-      <w:r>
-        <w:rPr>
-          <w:sz w:val="20"/>
-          <w:szCs w:val="20"/>
-        </w:rPr>
-        <w:t>“</w:t>
+        <w:t>El estado del reporte cambiará a “</w:t>
       </w:r>
       <w:r>
         <w:rPr>
@@ -4333,15 +4851,92 @@
           <w:sz w:val="20"/>
           <w:szCs w:val="20"/>
         </w:rPr>
-        <w:t>”</w:t>
-      </w:r>
-      <w:r>
-        <w:rPr>
-          <w:sz w:val="20"/>
-          <w:szCs w:val="20"/>
-        </w:rPr>
-        <w:t xml:space="preserve"> y el empleado recibirá una notificación.</w:t>
-      </w:r>
+        <w:t>” y el empleado recibirá una notificación.</w:t>
+      </w:r>
+    </w:p>
+    <w:p>
+      <w:pPr>
+        <w:pStyle w:val="Prrafodelista"/>
+        <w:spacing w:line="360" w:lineRule="auto"/>
+        <w:ind w:left="342" w:firstLine="0"/>
+        <w:rPr>
+          <w:sz w:val="20"/>
+          <w:szCs w:val="20"/>
+        </w:rPr>
+      </w:pPr>
+    </w:p>
+    <w:p>
+      <w:pPr>
+        <w:spacing w:line="360" w:lineRule="auto"/>
+        <w:ind w:left="119"/>
+        <w:rPr>
+          <w:sz w:val="20"/>
+          <w:szCs w:val="20"/>
+        </w:rPr>
+      </w:pPr>
+      <w:r>
+        <w:rPr>
+          <w:noProof/>
+        </w:rPr>
+        <w:drawing>
+          <wp:inline distT="0" distB="0" distL="0" distR="0" wp14:anchorId="7B96D199" wp14:editId="77AEA833">
+            <wp:extent cx="6404610" cy="1191895"/>
+            <wp:effectExtent l="0" t="0" r="0" b="8255"/>
+            <wp:docPr id="720373564" name="Imagen 9"/>
+            <wp:cNvGraphicFramePr>
+              <a:graphicFrameLocks xmlns:a="http://schemas.openxmlformats.org/drawingml/2006/main" noChangeAspect="1"/>
+            </wp:cNvGraphicFramePr>
+            <a:graphic xmlns:a="http://schemas.openxmlformats.org/drawingml/2006/main">
+              <a:graphicData uri="http://schemas.openxmlformats.org/drawingml/2006/picture">
+                <pic:pic xmlns:pic="http://schemas.openxmlformats.org/drawingml/2006/picture">
+                  <pic:nvPicPr>
+                    <pic:cNvPr id="0" name="Picture 17"/>
+                    <pic:cNvPicPr>
+                      <a:picLocks noChangeAspect="1" noChangeArrowheads="1"/>
+                    </pic:cNvPicPr>
+                  </pic:nvPicPr>
+                  <pic:blipFill>
+                    <a:blip r:embed="rId17">
+                      <a:extLst>
+                        <a:ext uri="{28A0092B-C50C-407E-A947-70E740481C1C}">
+                          <a14:useLocalDpi xmlns:a14="http://schemas.microsoft.com/office/drawing/2010/main" val="0"/>
+                        </a:ext>
+                      </a:extLst>
+                    </a:blip>
+                    <a:srcRect/>
+                    <a:stretch>
+                      <a:fillRect/>
+                    </a:stretch>
+                  </pic:blipFill>
+                  <pic:spPr bwMode="auto">
+                    <a:xfrm>
+                      <a:off x="0" y="0"/>
+                      <a:ext cx="6404610" cy="1191895"/>
+                    </a:xfrm>
+                    <a:prstGeom prst="rect">
+                      <a:avLst/>
+                    </a:prstGeom>
+                    <a:noFill/>
+                    <a:ln>
+                      <a:noFill/>
+                    </a:ln>
+                  </pic:spPr>
+                </pic:pic>
+              </a:graphicData>
+            </a:graphic>
+          </wp:inline>
+        </w:drawing>
+      </w:r>
+    </w:p>
+    <w:p>
+      <w:pPr>
+        <w:spacing w:line="360" w:lineRule="auto"/>
+        <w:ind w:left="119"/>
+        <w:rPr>
+          <w:sz w:val="20"/>
+          <w:szCs w:val="20"/>
+        </w:rPr>
+      </w:pPr>
     </w:p>
     <w:p>
       <w:pPr>
@@ -4535,23 +5130,7 @@
           <w:bCs/>
           <w:color w:val="375623"/>
         </w:rPr>
-        <w:t>Reco</w:t>
-      </w:r>
-      <w:r>
-        <w:rPr>
-          <w:b/>
-          <w:bCs/>
-          <w:color w:val="375623"/>
-        </w:rPr>
-        <w:t>rdatorio</w:t>
-      </w:r>
-      <w:r>
-        <w:rPr>
-          <w:b/>
-          <w:bCs/>
-          <w:color w:val="375623"/>
-        </w:rPr>
-        <w:t xml:space="preserve">: </w:t>
+        <w:t xml:space="preserve">Recordatorio: </w:t>
       </w:r>
       <w:r>
         <w:rPr>
@@ -4763,10 +5342,85 @@
     <w:p>
       <w:pPr>
         <w:pStyle w:val="Textoindependiente"/>
-        <w:spacing w:line="229" w:lineRule="exact"/>
-        <w:ind w:left="120"/>
-        <w:jc w:val="both"/>
-      </w:pPr>
+        <w:spacing w:line="360" w:lineRule="auto"/>
+        <w:ind w:left="120" w:right="1132"/>
+        <w:rPr>
+          <w:szCs w:val="22"/>
+        </w:rPr>
+      </w:pPr>
+    </w:p>
+    <w:p>
+      <w:pPr>
+        <w:pStyle w:val="Textoindependiente"/>
+        <w:spacing w:line="360" w:lineRule="auto"/>
+        <w:ind w:left="120" w:right="1132"/>
+        <w:rPr>
+          <w:szCs w:val="22"/>
+        </w:rPr>
+      </w:pPr>
+      <w:r>
+        <w:rPr>
+          <w:noProof/>
+        </w:rPr>
+        <w:drawing>
+          <wp:inline distT="0" distB="0" distL="0" distR="0" wp14:anchorId="1F478EB3" wp14:editId="1D7939B2">
+            <wp:extent cx="6404610" cy="2240280"/>
+            <wp:effectExtent l="0" t="0" r="0" b="7620"/>
+            <wp:docPr id="1930768188" name="Imagen 10"/>
+            <wp:cNvGraphicFramePr>
+              <a:graphicFrameLocks xmlns:a="http://schemas.openxmlformats.org/drawingml/2006/main" noChangeAspect="1"/>
+            </wp:cNvGraphicFramePr>
+            <a:graphic xmlns:a="http://schemas.openxmlformats.org/drawingml/2006/main">
+              <a:graphicData uri="http://schemas.openxmlformats.org/drawingml/2006/picture">
+                <pic:pic xmlns:pic="http://schemas.openxmlformats.org/drawingml/2006/picture">
+                  <pic:nvPicPr>
+                    <pic:cNvPr id="0" name="Picture 19"/>
+                    <pic:cNvPicPr>
+                      <a:picLocks noChangeAspect="1" noChangeArrowheads="1"/>
+                    </pic:cNvPicPr>
+                  </pic:nvPicPr>
+                  <pic:blipFill>
+                    <a:blip r:embed="rId18">
+                      <a:extLst>
+                        <a:ext uri="{28A0092B-C50C-407E-A947-70E740481C1C}">
+                          <a14:useLocalDpi xmlns:a14="http://schemas.microsoft.com/office/drawing/2010/main" val="0"/>
+                        </a:ext>
+                      </a:extLst>
+                    </a:blip>
+                    <a:srcRect/>
+                    <a:stretch>
+                      <a:fillRect/>
+                    </a:stretch>
+                  </pic:blipFill>
+                  <pic:spPr bwMode="auto">
+                    <a:xfrm>
+                      <a:off x="0" y="0"/>
+                      <a:ext cx="6404610" cy="2240280"/>
+                    </a:xfrm>
+                    <a:prstGeom prst="rect">
+                      <a:avLst/>
+                    </a:prstGeom>
+                    <a:noFill/>
+                    <a:ln>
+                      <a:noFill/>
+                    </a:ln>
+                  </pic:spPr>
+                </pic:pic>
+              </a:graphicData>
+            </a:graphic>
+          </wp:inline>
+        </w:drawing>
+      </w:r>
+    </w:p>
+    <w:p>
+      <w:pPr>
+        <w:rPr>
+          <w:sz w:val="20"/>
+        </w:rPr>
+      </w:pPr>
+      <w:r>
+        <w:br w:type="page"/>
+      </w:r>
     </w:p>
     <w:p>
       <w:pPr>
@@ -4777,6 +5431,7 @@
         <w:rPr>
           <w:color w:val="313B54"/>
         </w:rPr>
+        <w:lastRenderedPageBreak/>
         <w:t>Gestión de Usuarios</w:t>
       </w:r>
     </w:p>
@@ -5180,6 +5835,82 @@
           <w:szCs w:val="20"/>
         </w:rPr>
       </w:pPr>
+      <w:r>
+        <w:rPr>
+          <w:noProof/>
+        </w:rPr>
+        <w:drawing>
+          <wp:inline distT="0" distB="0" distL="0" distR="0" wp14:anchorId="4378F4BD" wp14:editId="56D6BFD8">
+            <wp:extent cx="6404610" cy="2802890"/>
+            <wp:effectExtent l="0" t="0" r="0" b="0"/>
+            <wp:docPr id="355781739" name="Imagen 11"/>
+            <wp:cNvGraphicFramePr>
+              <a:graphicFrameLocks xmlns:a="http://schemas.openxmlformats.org/drawingml/2006/main" noChangeAspect="1"/>
+            </wp:cNvGraphicFramePr>
+            <a:graphic xmlns:a="http://schemas.openxmlformats.org/drawingml/2006/main">
+              <a:graphicData uri="http://schemas.openxmlformats.org/drawingml/2006/picture">
+                <pic:pic xmlns:pic="http://schemas.openxmlformats.org/drawingml/2006/picture">
+                  <pic:nvPicPr>
+                    <pic:cNvPr id="0" name="Picture 21"/>
+                    <pic:cNvPicPr>
+                      <a:picLocks noChangeAspect="1" noChangeArrowheads="1"/>
+                    </pic:cNvPicPr>
+                  </pic:nvPicPr>
+                  <pic:blipFill>
+                    <a:blip r:embed="rId19">
+                      <a:extLst>
+                        <a:ext uri="{28A0092B-C50C-407E-A947-70E740481C1C}">
+                          <a14:useLocalDpi xmlns:a14="http://schemas.microsoft.com/office/drawing/2010/main" val="0"/>
+                        </a:ext>
+                      </a:extLst>
+                    </a:blip>
+                    <a:srcRect/>
+                    <a:stretch>
+                      <a:fillRect/>
+                    </a:stretch>
+                  </pic:blipFill>
+                  <pic:spPr bwMode="auto">
+                    <a:xfrm>
+                      <a:off x="0" y="0"/>
+                      <a:ext cx="6404610" cy="2802890"/>
+                    </a:xfrm>
+                    <a:prstGeom prst="rect">
+                      <a:avLst/>
+                    </a:prstGeom>
+                    <a:noFill/>
+                    <a:ln>
+                      <a:noFill/>
+                    </a:ln>
+                  </pic:spPr>
+                </pic:pic>
+              </a:graphicData>
+            </a:graphic>
+          </wp:inline>
+        </w:drawing>
+      </w:r>
+    </w:p>
+    <w:p>
+      <w:pPr>
+        <w:rPr>
+          <w:sz w:val="20"/>
+          <w:szCs w:val="20"/>
+        </w:rPr>
+      </w:pPr>
+      <w:r>
+        <w:rPr>
+          <w:sz w:val="20"/>
+          <w:szCs w:val="20"/>
+        </w:rPr>
+        <w:br w:type="page"/>
+      </w:r>
+    </w:p>
+    <w:p>
+      <w:pPr>
+        <w:rPr>
+          <w:sz w:val="20"/>
+          <w:szCs w:val="20"/>
+        </w:rPr>
+      </w:pPr>
     </w:p>
     <w:p>
       <w:pPr>
@@ -5364,24 +6095,6 @@
     </w:p>
     <w:p>
       <w:pPr>
-        <w:pStyle w:val="Textoindependiente"/>
-        <w:spacing w:line="360" w:lineRule="auto"/>
-      </w:pPr>
-    </w:p>
-    <w:p>
-      <w:pPr>
-        <w:pStyle w:val="Textoindependiente"/>
-        <w:spacing w:line="360" w:lineRule="auto"/>
-      </w:pPr>
-    </w:p>
-    <w:p>
-      <w:pPr>
-        <w:pStyle w:val="Textoindependiente"/>
-        <w:spacing w:line="360" w:lineRule="auto"/>
-      </w:pPr>
-    </w:p>
-    <w:p>
-      <w:pPr>
         <w:pStyle w:val="Ttulo3"/>
         <w:spacing w:line="360" w:lineRule="auto"/>
         <w:jc w:val="both"/>
@@ -5397,7 +6110,6 @@
           <w:sz w:val="20"/>
           <w:szCs w:val="20"/>
         </w:rPr>
-        <w:lastRenderedPageBreak/>
         <w:t>Edita un</w:t>
       </w:r>
       <w:r>
@@ -5655,13 +6367,68 @@
         <w:t>” y confirma la acción.</w:t>
       </w:r>
     </w:p>
-    <w:p>
-      <w:pPr>
-        <w:rPr>
-          <w:sz w:val="20"/>
-          <w:szCs w:val="20"/>
-        </w:rPr>
-      </w:pPr>
+    <w:p/>
+    <w:p/>
+    <w:p>
+      <w:pPr>
+        <w:rPr>
+          <w:sz w:val="20"/>
+          <w:szCs w:val="20"/>
+        </w:rPr>
+      </w:pPr>
+      <w:r>
+        <w:rPr>
+          <w:noProof/>
+        </w:rPr>
+        <w:drawing>
+          <wp:inline distT="0" distB="0" distL="0" distR="0" wp14:anchorId="0406E53A" wp14:editId="25C35956">
+            <wp:extent cx="6404610" cy="2402205"/>
+            <wp:effectExtent l="0" t="0" r="0" b="0"/>
+            <wp:docPr id="314854699" name="Imagen 12"/>
+            <wp:cNvGraphicFramePr>
+              <a:graphicFrameLocks xmlns:a="http://schemas.openxmlformats.org/drawingml/2006/main" noChangeAspect="1"/>
+            </wp:cNvGraphicFramePr>
+            <a:graphic xmlns:a="http://schemas.openxmlformats.org/drawingml/2006/main">
+              <a:graphicData uri="http://schemas.openxmlformats.org/drawingml/2006/picture">
+                <pic:pic xmlns:pic="http://schemas.openxmlformats.org/drawingml/2006/picture">
+                  <pic:nvPicPr>
+                    <pic:cNvPr id="0" name="Picture 23"/>
+                    <pic:cNvPicPr>
+                      <a:picLocks noChangeAspect="1" noChangeArrowheads="1"/>
+                    </pic:cNvPicPr>
+                  </pic:nvPicPr>
+                  <pic:blipFill>
+                    <a:blip r:embed="rId20">
+                      <a:extLst>
+                        <a:ext uri="{28A0092B-C50C-407E-A947-70E740481C1C}">
+                          <a14:useLocalDpi xmlns:a14="http://schemas.microsoft.com/office/drawing/2010/main" val="0"/>
+                        </a:ext>
+                      </a:extLst>
+                    </a:blip>
+                    <a:srcRect/>
+                    <a:stretch>
+                      <a:fillRect/>
+                    </a:stretch>
+                  </pic:blipFill>
+                  <pic:spPr bwMode="auto">
+                    <a:xfrm>
+                      <a:off x="0" y="0"/>
+                      <a:ext cx="6404610" cy="2402205"/>
+                    </a:xfrm>
+                    <a:prstGeom prst="rect">
+                      <a:avLst/>
+                    </a:prstGeom>
+                    <a:noFill/>
+                    <a:ln>
+                      <a:noFill/>
+                    </a:ln>
+                  </pic:spPr>
+                </pic:pic>
+              </a:graphicData>
+            </a:graphic>
+          </wp:inline>
+        </w:drawing>
+      </w:r>
       <w:r>
         <w:br w:type="page"/>
       </w:r>
@@ -6002,28 +6769,7 @@
           <w:sz w:val="20"/>
           <w:szCs w:val="20"/>
         </w:rPr>
-        <w:t>socio</w:t>
-      </w:r>
-      <w:r>
-        <w:rPr>
-          <w:sz w:val="20"/>
-          <w:szCs w:val="20"/>
-        </w:rPr>
-        <w:t xml:space="preserve">, </w:t>
-      </w:r>
-      <w:r>
-        <w:rPr>
-          <w:sz w:val="20"/>
-          <w:szCs w:val="20"/>
-        </w:rPr>
-        <w:t>cliente</w:t>
-      </w:r>
-      <w:r>
-        <w:rPr>
-          <w:sz w:val="20"/>
-          <w:szCs w:val="20"/>
-        </w:rPr>
-        <w:t>, proyecto y actividad</w:t>
+        <w:t>socio, cliente, proyecto y actividad</w:t>
       </w:r>
       <w:r>
         <w:rPr>
@@ -6250,12 +6996,81 @@
     </w:p>
     <w:p>
       <w:pPr>
+        <w:spacing w:line="360" w:lineRule="auto"/>
         <w:ind w:left="119"/>
         <w:rPr>
           <w:sz w:val="20"/>
           <w:szCs w:val="20"/>
         </w:rPr>
       </w:pPr>
+      <w:r>
+        <w:rPr>
+          <w:noProof/>
+        </w:rPr>
+        <w:drawing>
+          <wp:inline distT="0" distB="0" distL="0" distR="0" wp14:anchorId="4969699B" wp14:editId="3D2301EB">
+            <wp:extent cx="6404610" cy="2422525"/>
+            <wp:effectExtent l="0" t="0" r="0" b="0"/>
+            <wp:docPr id="520763372" name="Imagen 13"/>
+            <wp:cNvGraphicFramePr>
+              <a:graphicFrameLocks xmlns:a="http://schemas.openxmlformats.org/drawingml/2006/main" noChangeAspect="1"/>
+            </wp:cNvGraphicFramePr>
+            <a:graphic xmlns:a="http://schemas.openxmlformats.org/drawingml/2006/main">
+              <a:graphicData uri="http://schemas.openxmlformats.org/drawingml/2006/picture">
+                <pic:pic xmlns:pic="http://schemas.openxmlformats.org/drawingml/2006/picture">
+                  <pic:nvPicPr>
+                    <pic:cNvPr id="0" name="Picture 25"/>
+                    <pic:cNvPicPr>
+                      <a:picLocks noChangeAspect="1" noChangeArrowheads="1"/>
+                    </pic:cNvPicPr>
+                  </pic:nvPicPr>
+                  <pic:blipFill>
+                    <a:blip r:embed="rId21">
+                      <a:extLst>
+                        <a:ext uri="{28A0092B-C50C-407E-A947-70E740481C1C}">
+                          <a14:useLocalDpi xmlns:a14="http://schemas.microsoft.com/office/drawing/2010/main" val="0"/>
+                        </a:ext>
+                      </a:extLst>
+                    </a:blip>
+                    <a:srcRect/>
+                    <a:stretch>
+                      <a:fillRect/>
+                    </a:stretch>
+                  </pic:blipFill>
+                  <pic:spPr bwMode="auto">
+                    <a:xfrm>
+                      <a:off x="0" y="0"/>
+                      <a:ext cx="6404610" cy="2422525"/>
+                    </a:xfrm>
+                    <a:prstGeom prst="rect">
+                      <a:avLst/>
+                    </a:prstGeom>
+                    <a:noFill/>
+                    <a:ln>
+                      <a:noFill/>
+                    </a:ln>
+                  </pic:spPr>
+                </pic:pic>
+              </a:graphicData>
+            </a:graphic>
+          </wp:inline>
+        </w:drawing>
+      </w:r>
+    </w:p>
+    <w:p>
+      <w:pPr>
+        <w:rPr>
+          <w:sz w:val="20"/>
+          <w:szCs w:val="20"/>
+        </w:rPr>
+      </w:pPr>
+      <w:r>
+        <w:rPr>
+          <w:sz w:val="20"/>
+          <w:szCs w:val="20"/>
+        </w:rPr>
+        <w:br w:type="page"/>
+      </w:r>
     </w:p>
     <w:p>
       <w:pPr>
@@ -6266,6 +7081,7 @@
         <w:rPr>
           <w:color w:val="313B54"/>
         </w:rPr>
+        <w:lastRenderedPageBreak/>
         <w:t>Exportación de Reportes</w:t>
       </w:r>
     </w:p>
@@ -6402,6 +7218,76 @@
           <w:sz w:val="20"/>
         </w:rPr>
         <w:t xml:space="preserve"> se descargará automáticamente a tu computadora.</w:t>
+      </w:r>
+    </w:p>
+    <w:p>
+      <w:pPr>
+        <w:spacing w:line="360" w:lineRule="auto"/>
+        <w:ind w:left="342"/>
+        <w:rPr>
+          <w:sz w:val="20"/>
+        </w:rPr>
+      </w:pPr>
+    </w:p>
+    <w:p>
+      <w:pPr>
+        <w:spacing w:line="360" w:lineRule="auto"/>
+        <w:rPr>
+          <w:sz w:val="20"/>
+        </w:rPr>
+      </w:pPr>
+      <w:r>
+        <w:rPr>
+          <w:noProof/>
+        </w:rPr>
+        <w:drawing>
+          <wp:inline distT="0" distB="0" distL="0" distR="0" wp14:anchorId="717078E3" wp14:editId="7A7B0065">
+            <wp:extent cx="6404610" cy="2503170"/>
+            <wp:effectExtent l="0" t="0" r="0" b="0"/>
+            <wp:docPr id="1351640020" name="Imagen 14"/>
+            <wp:cNvGraphicFramePr>
+              <a:graphicFrameLocks xmlns:a="http://schemas.openxmlformats.org/drawingml/2006/main" noChangeAspect="1"/>
+            </wp:cNvGraphicFramePr>
+            <a:graphic xmlns:a="http://schemas.openxmlformats.org/drawingml/2006/main">
+              <a:graphicData uri="http://schemas.openxmlformats.org/drawingml/2006/picture">
+                <pic:pic xmlns:pic="http://schemas.openxmlformats.org/drawingml/2006/picture">
+                  <pic:nvPicPr>
+                    <pic:cNvPr id="0" name="Picture 27"/>
+                    <pic:cNvPicPr>
+                      <a:picLocks noChangeAspect="1" noChangeArrowheads="1"/>
+                    </pic:cNvPicPr>
+                  </pic:nvPicPr>
+                  <pic:blipFill>
+                    <a:blip r:embed="rId22">
+                      <a:extLst>
+                        <a:ext uri="{28A0092B-C50C-407E-A947-70E740481C1C}">
+                          <a14:useLocalDpi xmlns:a14="http://schemas.microsoft.com/office/drawing/2010/main" val="0"/>
+                        </a:ext>
+                      </a:extLst>
+                    </a:blip>
+                    <a:srcRect/>
+                    <a:stretch>
+                      <a:fillRect/>
+                    </a:stretch>
+                  </pic:blipFill>
+                  <pic:spPr bwMode="auto">
+                    <a:xfrm>
+                      <a:off x="0" y="0"/>
+                      <a:ext cx="6404610" cy="2503170"/>
+                    </a:xfrm>
+                    <a:prstGeom prst="rect">
+                      <a:avLst/>
+                    </a:prstGeom>
+                    <a:noFill/>
+                    <a:ln>
+                      <a:noFill/>
+                    </a:ln>
+                  </pic:spPr>
+                </pic:pic>
+              </a:graphicData>
+            </a:graphic>
+          </wp:inline>
+        </w:drawing>
       </w:r>
     </w:p>
     <w:p>
@@ -6815,7 +7701,13 @@
         <w:t xml:space="preserve"> </w:t>
       </w:r>
       <w:r>
-        <w:t>Contacta a tu administrador para que verifique la existencia del proyecto, y en su defecto carge el nuevo proyecto correspondiente. Solo ves los proyectos que han sido cargados al sistema.</w:t>
+        <w:t xml:space="preserve">Contacta a tu administrador para que verifique la existencia del proyecto, y en su defecto </w:t>
+      </w:r>
+      <w:r>
+        <w:t>cargue</w:t>
+      </w:r>
+      <w:r>
+        <w:t xml:space="preserve"> el nuevo proyecto correspondiente. Solo ves los proyectos que han sido cargados al sistema.</w:t>
       </w:r>
     </w:p>
     <w:p>
@@ -7189,7 +8081,35 @@
         <w:rPr>
           <w:lang w:val="es-MX"/>
         </w:rPr>
-        <w:t>Recarga la página (Ctrl+R o Cmd+R)</w:t>
+        <w:t>Recarga la página (</w:t>
+      </w:r>
+      <w:proofErr w:type="spellStart"/>
+      <w:r>
+        <w:rPr>
+          <w:lang w:val="es-MX"/>
+        </w:rPr>
+        <w:t>Ctrl+R</w:t>
+      </w:r>
+      <w:proofErr w:type="spellEnd"/>
+      <w:r>
+        <w:rPr>
+          <w:lang w:val="es-MX"/>
+        </w:rPr>
+        <w:t xml:space="preserve"> o </w:t>
+      </w:r>
+      <w:proofErr w:type="spellStart"/>
+      <w:r>
+        <w:rPr>
+          <w:lang w:val="es-MX"/>
+        </w:rPr>
+        <w:t>Cmd+R</w:t>
+      </w:r>
+      <w:proofErr w:type="spellEnd"/>
+      <w:r>
+        <w:rPr>
+          <w:lang w:val="es-MX"/>
+        </w:rPr>
+        <w:t>)</w:t>
       </w:r>
       <w:r>
         <w:rPr>

</xml_diff>

<commit_message>
Nuevo contenido en la sección de preguntas frecuentes
</commit_message>
<xml_diff>
--- a/manual_tiempos.docx
+++ b/manual_tiempos.docx
@@ -7432,7 +7432,14 @@
         <w:ind w:left="120"/>
       </w:pPr>
       <w:r>
-        <w:t>¿Olvidé mi contraseña, qué debo hacer?</w:t>
+        <w:t>¿Se accede al nuevo sistema con el mismo enlace que el anterior?</w:t>
+      </w:r>
+      <w:r>
+        <w:br/>
+        <w:t>R:</w:t>
+      </w:r>
+      <w:r>
+        <w:t xml:space="preserve"> No. Este sistema es completamente diferente, por lo que los dominios son distintos.</w:t>
       </w:r>
     </w:p>
     <w:p>
@@ -7440,6 +7447,53 @@
         <w:pStyle w:val="Textoindependiente"/>
         <w:spacing w:line="229" w:lineRule="exact"/>
         <w:ind w:left="120"/>
+      </w:pPr>
+    </w:p>
+    <w:p>
+      <w:pPr>
+        <w:pStyle w:val="Textoindependiente"/>
+        <w:spacing w:line="229" w:lineRule="exact"/>
+        <w:ind w:left="120"/>
+      </w:pPr>
+      <w:r>
+        <w:t>¿Qué pasa si registro mi entrada tarde?</w:t>
+      </w:r>
+    </w:p>
+    <w:p>
+      <w:pPr>
+        <w:pStyle w:val="Textoindependiente"/>
+        <w:spacing w:line="229" w:lineRule="exact"/>
+        <w:ind w:left="120"/>
+      </w:pPr>
+      <w:r>
+        <w:t xml:space="preserve">R: </w:t>
+      </w:r>
+      <w:r>
+        <w:t>El sistema no tiene un control programado de retardos; por ello, solo calculará tu hora de salida tardía en función del total de horas de una jornada estándar.</w:t>
+      </w:r>
+    </w:p>
+    <w:p>
+      <w:pPr>
+        <w:pStyle w:val="Textoindependiente"/>
+        <w:spacing w:line="229" w:lineRule="exact"/>
+        <w:ind w:left="120"/>
+      </w:pPr>
+    </w:p>
+    <w:p>
+      <w:pPr>
+        <w:pStyle w:val="Textoindependiente"/>
+        <w:spacing w:line="229" w:lineRule="exact"/>
+        <w:ind w:left="120"/>
+      </w:pPr>
+      <w:r>
+        <w:t>¿Olvidé mi contraseña, qué debo hacer?</w:t>
+      </w:r>
+    </w:p>
+    <w:p>
+      <w:pPr>
+        <w:pStyle w:val="Textoindependiente"/>
+        <w:spacing w:line="229" w:lineRule="exact"/>
+        <w:ind w:left="120"/>
         <w:rPr>
           <w:lang w:val="es-MX"/>
         </w:rPr>
@@ -7531,6 +7585,54 @@
           <w:lang w:val="es-MX"/>
         </w:rPr>
         <w:t xml:space="preserve">después de un período de inactividad. </w:t>
+      </w:r>
+    </w:p>
+    <w:p>
+      <w:pPr>
+        <w:pStyle w:val="Textoindependiente"/>
+        <w:spacing w:line="229" w:lineRule="exact"/>
+        <w:ind w:left="120"/>
+        <w:rPr>
+          <w:lang w:val="es-MX"/>
+        </w:rPr>
+      </w:pPr>
+    </w:p>
+    <w:p>
+      <w:pPr>
+        <w:pStyle w:val="Textoindependiente"/>
+        <w:spacing w:line="229" w:lineRule="exact"/>
+        <w:ind w:left="120"/>
+        <w:rPr>
+          <w:lang w:val="es-MX"/>
+        </w:rPr>
+      </w:pPr>
+      <w:r>
+        <w:rPr>
+          <w:lang w:val="es-MX"/>
+        </w:rPr>
+        <w:t>¿Cómo registro horas extra si trabajé más de 8 horas?</w:t>
+      </w:r>
+    </w:p>
+    <w:p>
+      <w:pPr>
+        <w:pStyle w:val="Textoindependiente"/>
+        <w:spacing w:line="229" w:lineRule="exact"/>
+        <w:ind w:left="120"/>
+        <w:rPr>
+          <w:lang w:val="es-MX"/>
+        </w:rPr>
+      </w:pPr>
+      <w:r>
+        <w:rPr>
+          <w:lang w:val="es-MX"/>
+        </w:rPr>
+        <w:t xml:space="preserve">R: </w:t>
+      </w:r>
+      <w:r>
+        <w:rPr>
+          <w:lang w:val="es-MX"/>
+        </w:rPr>
+        <w:t>La plataforma no admite registros superiores a 8 horas; por ello, las asignaciones deben organizarse para concluirse antes del fin de la jornada.</w:t>
       </w:r>
     </w:p>
     <w:p>
@@ -7557,7 +7659,13 @@
         <w:rPr>
           <w:color w:val="313B54"/>
         </w:rPr>
-        <w:t>Para Empleados / Consultores</w:t>
+        <w:t xml:space="preserve">Para </w:t>
+      </w:r>
+      <w:r>
+        <w:rPr>
+          <w:color w:val="313B54"/>
+        </w:rPr>
+        <w:t>Colaboradores</w:t>
       </w:r>
     </w:p>
     <w:p>
@@ -7627,111 +7735,10 @@
         <w:pStyle w:val="Textoindependiente"/>
         <w:spacing w:line="229" w:lineRule="exact"/>
         <w:ind w:left="120"/>
+        <w:jc w:val="both"/>
         <w:rPr>
           <w:lang w:val="es-MX"/>
         </w:rPr>
-      </w:pPr>
-    </w:p>
-    <w:p>
-      <w:pPr>
-        <w:pStyle w:val="Textoindependiente"/>
-        <w:spacing w:line="229" w:lineRule="exact"/>
-        <w:ind w:left="120"/>
-      </w:pPr>
-      <w:r>
-        <w:t>¿Cuántos días hacia atrás puedo registrar tiempos?</w:t>
-      </w:r>
-    </w:p>
-    <w:p>
-      <w:pPr>
-        <w:pStyle w:val="Textoindependiente"/>
-        <w:spacing w:line="229" w:lineRule="exact"/>
-        <w:ind w:left="120"/>
-      </w:pPr>
-      <w:r>
-        <w:t>R</w:t>
-      </w:r>
-      <w:r>
-        <w:t>:</w:t>
-      </w:r>
-      <w:r>
-        <w:rPr>
-          <w:b/>
-          <w:bCs/>
-        </w:rPr>
-        <w:t xml:space="preserve"> </w:t>
-      </w:r>
-      <w:r>
-        <w:t>Se permiten registrar de manera extemporánea únicamente los días del mes en curso.</w:t>
-      </w:r>
-    </w:p>
-    <w:p>
-      <w:pPr>
-        <w:pStyle w:val="Textoindependiente"/>
-        <w:spacing w:line="229" w:lineRule="exact"/>
-        <w:ind w:left="120"/>
-        <w:rPr>
-          <w:lang w:val="es-MX"/>
-        </w:rPr>
-      </w:pPr>
-    </w:p>
-    <w:p>
-      <w:pPr>
-        <w:pStyle w:val="Textoindependiente"/>
-        <w:spacing w:line="229" w:lineRule="exact"/>
-        <w:ind w:left="120"/>
-      </w:pPr>
-      <w:r>
-        <w:t>¿Qué hago si el proyecto no aparece en la lista?</w:t>
-      </w:r>
-    </w:p>
-    <w:p>
-      <w:pPr>
-        <w:pStyle w:val="Textoindependiente"/>
-        <w:spacing w:line="229" w:lineRule="exact"/>
-        <w:ind w:left="120"/>
-      </w:pPr>
-      <w:r>
-        <w:t>R=</w:t>
-      </w:r>
-      <w:r>
-        <w:t>:</w:t>
-      </w:r>
-      <w:r>
-        <w:t xml:space="preserve"> </w:t>
-      </w:r>
-      <w:r>
-        <w:t xml:space="preserve">Contacta a tu administrador para que verifique la existencia del proyecto, y en su defecto </w:t>
-      </w:r>
-      <w:r>
-        <w:t>cargue</w:t>
-      </w:r>
-      <w:r>
-        <w:t xml:space="preserve"> el nuevo proyecto correspondiente. Solo ves los proyectos que han sido cargados al sistema.</w:t>
-      </w:r>
-    </w:p>
-    <w:p>
-      <w:pPr>
-        <w:rPr>
-          <w:lang w:val="es-MX"/>
-        </w:rPr>
-      </w:pPr>
-    </w:p>
-    <w:p>
-      <w:pPr>
-        <w:pStyle w:val="Ttulo3"/>
-        <w:jc w:val="both"/>
-      </w:pPr>
-      <w:r>
-        <w:rPr>
-          <w:color w:val="313B54"/>
-        </w:rPr>
-        <w:t>Para Supervisores</w:t>
-      </w:r>
-    </w:p>
-    <w:p>
-      <w:pPr>
-        <w:pStyle w:val="Textoindependiente"/>
       </w:pPr>
     </w:p>
     <w:p>
@@ -7740,6 +7747,221 @@
         <w:spacing w:line="229" w:lineRule="exact"/>
         <w:ind w:left="120"/>
         <w:jc w:val="both"/>
+        <w:rPr>
+          <w:lang w:val="es-MX"/>
+        </w:rPr>
+      </w:pPr>
+      <w:r>
+        <w:rPr>
+          <w:lang w:val="es-MX"/>
+        </w:rPr>
+        <w:t>¿Qué pasa si hice un registro con anticipación y me cambian de asignación cuando aún no he terminado la anterior?</w:t>
+      </w:r>
+    </w:p>
+    <w:p>
+      <w:pPr>
+        <w:pStyle w:val="Textoindependiente"/>
+        <w:spacing w:line="229" w:lineRule="exact"/>
+        <w:ind w:left="120"/>
+        <w:jc w:val="both"/>
+        <w:rPr>
+          <w:lang w:val="es-MX"/>
+        </w:rPr>
+      </w:pPr>
+      <w:r>
+        <w:rPr>
+          <w:lang w:val="es-MX"/>
+        </w:rPr>
+        <w:t xml:space="preserve">R: </w:t>
+      </w:r>
+      <w:r>
+        <w:rPr>
+          <w:lang w:val="es-MX"/>
+        </w:rPr>
+        <w:t>Si ya realizaste un registro y cambian los planes, puedes eliminarlo si aún no ha sido aprobado por tu jefe a cargo y crear uno nuevo con los cambios efectuados, o bien editar los registros directamente en la sección "Historial de registros".</w:t>
+      </w:r>
+    </w:p>
+    <w:p>
+      <w:pPr>
+        <w:pStyle w:val="Textoindependiente"/>
+        <w:spacing w:line="229" w:lineRule="exact"/>
+        <w:ind w:left="120"/>
+        <w:rPr>
+          <w:lang w:val="es-MX"/>
+        </w:rPr>
+      </w:pPr>
+    </w:p>
+    <w:p>
+      <w:pPr>
+        <w:pStyle w:val="Textoindependiente"/>
+        <w:spacing w:line="229" w:lineRule="exact"/>
+        <w:ind w:left="120"/>
+      </w:pPr>
+      <w:r>
+        <w:t>¿Cuántos días hacia atrás puedo registrar tiempos?</w:t>
+      </w:r>
+    </w:p>
+    <w:p>
+      <w:pPr>
+        <w:pStyle w:val="Textoindependiente"/>
+        <w:spacing w:line="229" w:lineRule="exact"/>
+        <w:ind w:left="120"/>
+      </w:pPr>
+      <w:r>
+        <w:t>R</w:t>
+      </w:r>
+      <w:r>
+        <w:t>:</w:t>
+      </w:r>
+      <w:r>
+        <w:rPr>
+          <w:b/>
+          <w:bCs/>
+        </w:rPr>
+        <w:t xml:space="preserve"> </w:t>
+      </w:r>
+      <w:r>
+        <w:t>Se permiten registrar de manera extemporánea únicamente los días del mes en curso.</w:t>
+      </w:r>
+    </w:p>
+    <w:p>
+      <w:pPr>
+        <w:pStyle w:val="Textoindependiente"/>
+        <w:spacing w:line="229" w:lineRule="exact"/>
+        <w:ind w:left="120"/>
+        <w:rPr>
+          <w:lang w:val="es-MX"/>
+        </w:rPr>
+      </w:pPr>
+    </w:p>
+    <w:p>
+      <w:pPr>
+        <w:pStyle w:val="Textoindependiente"/>
+        <w:spacing w:line="229" w:lineRule="exact"/>
+        <w:ind w:left="120"/>
+      </w:pPr>
+      <w:r>
+        <w:t>¿Qué hago si el proyecto no aparece en la lista?</w:t>
+      </w:r>
+    </w:p>
+    <w:p>
+      <w:pPr>
+        <w:pStyle w:val="Textoindependiente"/>
+        <w:spacing w:line="229" w:lineRule="exact"/>
+        <w:ind w:left="120"/>
+      </w:pPr>
+      <w:r>
+        <w:t>R=</w:t>
+      </w:r>
+      <w:r>
+        <w:t>:</w:t>
+      </w:r>
+      <w:r>
+        <w:t xml:space="preserve"> </w:t>
+      </w:r>
+      <w:r>
+        <w:t>Solo verás los proyectos que se han cargado al sistema. Contacta a tu administrador para verificar la existencia del proyecto y, en su caso, cargar el nuevo proyecto correspondiente.</w:t>
+      </w:r>
+    </w:p>
+    <w:p>
+      <w:pPr>
+        <w:pStyle w:val="Textoindependiente"/>
+        <w:spacing w:line="229" w:lineRule="exact"/>
+        <w:ind w:left="120"/>
+      </w:pPr>
+    </w:p>
+    <w:p>
+      <w:pPr>
+        <w:pStyle w:val="Textoindependiente"/>
+        <w:spacing w:line="229" w:lineRule="exact"/>
+        <w:ind w:left="120"/>
+      </w:pPr>
+      <w:r>
+        <w:t>¿Cómo puedo seleccionar al socio que está a cargo del proyecto en mi registro de actividades?</w:t>
+      </w:r>
+    </w:p>
+    <w:p>
+      <w:pPr>
+        <w:pStyle w:val="Textoindependiente"/>
+        <w:spacing w:line="229" w:lineRule="exact"/>
+        <w:ind w:left="120"/>
+      </w:pPr>
+      <w:r>
+        <w:t xml:space="preserve">R: </w:t>
+      </w:r>
+      <w:r>
+        <w:t>El sistema relaciona a cada socio con sus proyectos desde que se dan de alta, por lo que no tienes que preocuparte por seleccionarlo. Esto, además de facilitar el registro, evita errores al cargar proyectos al socio equivocado.</w:t>
+      </w:r>
+    </w:p>
+    <w:p>
+      <w:pPr>
+        <w:rPr>
+          <w:lang w:val="es-MX"/>
+        </w:rPr>
+      </w:pPr>
+    </w:p>
+    <w:p>
+      <w:pPr>
+        <w:pStyle w:val="Ttulo3"/>
+        <w:jc w:val="both"/>
+      </w:pPr>
+      <w:r>
+        <w:rPr>
+          <w:color w:val="313B54"/>
+        </w:rPr>
+        <w:t xml:space="preserve">Para </w:t>
+      </w:r>
+      <w:r>
+        <w:rPr>
+          <w:color w:val="313B54"/>
+        </w:rPr>
+        <w:t>jefes a cargo</w:t>
+      </w:r>
+    </w:p>
+    <w:p>
+      <w:pPr>
+        <w:pStyle w:val="Textoindependiente"/>
+      </w:pPr>
+    </w:p>
+    <w:p>
+      <w:pPr>
+        <w:pStyle w:val="Textoindependiente"/>
+        <w:spacing w:line="229" w:lineRule="exact"/>
+        <w:ind w:left="120"/>
+        <w:jc w:val="both"/>
+      </w:pPr>
+      <w:r>
+        <w:t>¿Tengo un periodo definido para poder validar o rechazar reportes?</w:t>
+      </w:r>
+    </w:p>
+    <w:p>
+      <w:pPr>
+        <w:pStyle w:val="Textoindependiente"/>
+        <w:spacing w:line="229" w:lineRule="exact"/>
+        <w:ind w:left="120"/>
+        <w:jc w:val="both"/>
+      </w:pPr>
+      <w:r>
+        <w:t xml:space="preserve">R: </w:t>
+      </w:r>
+      <w:r>
+        <w:t>No. Puedes validarlos o rechazarlos con la frecuencia que mejor se adapte a tus tiempos; sin embargo, recuerda que los reportes se irán acumulando y que aquellos que no valides se perderán al final del mes y afectarán a tu equipo.</w:t>
+      </w:r>
+    </w:p>
+    <w:p>
+      <w:pPr>
+        <w:pStyle w:val="Textoindependiente"/>
+        <w:spacing w:line="229" w:lineRule="exact"/>
+        <w:ind w:left="120"/>
+        <w:jc w:val="both"/>
+      </w:pPr>
+    </w:p>
+    <w:p>
+      <w:pPr>
+        <w:pStyle w:val="Textoindependiente"/>
+        <w:spacing w:line="229" w:lineRule="exact"/>
+        <w:ind w:left="120"/>
+        <w:jc w:val="both"/>
       </w:pPr>
       <w:r>
         <w:t>¿Puedo ver los reportes de empleados fuera de mi equipo?</w:t>
@@ -7771,6 +7993,7 @@
         <w:rPr>
           <w:color w:val="313B54"/>
         </w:rPr>
+        <w:lastRenderedPageBreak/>
         <w:t>Para Administradores</w:t>
       </w:r>
     </w:p>
@@ -8081,35 +8304,7 @@
         <w:rPr>
           <w:lang w:val="es-MX"/>
         </w:rPr>
-        <w:t>Recarga la página (</w:t>
-      </w:r>
-      <w:proofErr w:type="spellStart"/>
-      <w:r>
-        <w:rPr>
-          <w:lang w:val="es-MX"/>
-        </w:rPr>
-        <w:t>Ctrl+R</w:t>
-      </w:r>
-      <w:proofErr w:type="spellEnd"/>
-      <w:r>
-        <w:rPr>
-          <w:lang w:val="es-MX"/>
-        </w:rPr>
-        <w:t xml:space="preserve"> o </w:t>
-      </w:r>
-      <w:proofErr w:type="spellStart"/>
-      <w:r>
-        <w:rPr>
-          <w:lang w:val="es-MX"/>
-        </w:rPr>
-        <w:t>Cmd+R</w:t>
-      </w:r>
-      <w:proofErr w:type="spellEnd"/>
-      <w:r>
-        <w:rPr>
-          <w:lang w:val="es-MX"/>
-        </w:rPr>
-        <w:t>)</w:t>
+        <w:t>Recarga la página (Ctrl+R o Cmd+R)</w:t>
       </w:r>
       <w:r>
         <w:rPr>

</xml_diff>

<commit_message>
Se actualizó el bloque de validación del jefe a cargo
</commit_message>
<xml_diff>
--- a/manual_tiempos.docx
+++ b/manual_tiempos.docx
@@ -3092,14 +3092,171 @@
     <w:p>
       <w:pPr>
         <w:pStyle w:val="Ttulo3"/>
+        <w:spacing w:before="240" w:line="360" w:lineRule="auto"/>
         <w:jc w:val="both"/>
-      </w:pPr>
-      <w:r>
         <w:rPr>
           <w:color w:val="313B54"/>
           <w:spacing w:val="-4"/>
+          <w:sz w:val="20"/>
+          <w:szCs w:val="20"/>
+        </w:rPr>
+      </w:pPr>
+      <w:r>
+        <w:rPr>
+          <w:color w:val="313B54"/>
+          <w:spacing w:val="-4"/>
+          <w:sz w:val="20"/>
+          <w:szCs w:val="20"/>
         </w:rPr>
         <w:lastRenderedPageBreak/>
+        <w:t>Editar un registro</w:t>
+      </w:r>
+    </w:p>
+    <w:p>
+      <w:pPr>
+        <w:pStyle w:val="Textoindependiente"/>
+        <w:numPr>
+          <w:ilvl w:val="0"/>
+          <w:numId w:val="19"/>
+        </w:numPr>
+        <w:spacing w:line="360" w:lineRule="auto"/>
+      </w:pPr>
+      <w:r>
+        <w:t>Puedes editar registros si aún no han sido aprobados o si fueron rechazados.</w:t>
+      </w:r>
+    </w:p>
+    <w:p>
+      <w:pPr>
+        <w:pStyle w:val="Textoindependiente"/>
+        <w:numPr>
+          <w:ilvl w:val="0"/>
+          <w:numId w:val="19"/>
+        </w:numPr>
+        <w:spacing w:line="360" w:lineRule="auto"/>
+      </w:pPr>
+      <w:r>
+        <w:t xml:space="preserve">Para consultarlos puedes dirigirte al </w:t>
+      </w:r>
+      <w:r>
+        <w:rPr>
+          <w:b/>
+          <w:bCs/>
+        </w:rPr>
+        <w:t xml:space="preserve">Historial de Registros </w:t>
+      </w:r>
+      <w:r>
+        <w:t>y filtrar por estado o por fecha.</w:t>
+      </w:r>
+    </w:p>
+    <w:p>
+      <w:pPr>
+        <w:pStyle w:val="Textoindependiente"/>
+        <w:numPr>
+          <w:ilvl w:val="0"/>
+          <w:numId w:val="19"/>
+        </w:numPr>
+        <w:spacing w:line="360" w:lineRule="auto"/>
+      </w:pPr>
+      <w:r>
+        <w:t>Una vez ubicado el registro que se desea editar, presiona el icono azul que está en la esquina superior derecha de este mismo.</w:t>
+      </w:r>
+    </w:p>
+    <w:p>
+      <w:pPr>
+        <w:pStyle w:val="Textoindependiente"/>
+        <w:numPr>
+          <w:ilvl w:val="0"/>
+          <w:numId w:val="19"/>
+        </w:numPr>
+        <w:spacing w:line="360" w:lineRule="auto"/>
+      </w:pPr>
+      <w:r>
+        <w:t>Podrás cambiar todos los elementos, igual que cuando recién haces un registro nuevo.</w:t>
+      </w:r>
+    </w:p>
+    <w:p>
+      <w:pPr>
+        <w:pStyle w:val="Textoindependiente"/>
+        <w:spacing w:line="360" w:lineRule="auto"/>
+        <w:ind w:left="480"/>
+      </w:pPr>
+    </w:p>
+    <w:p>
+      <w:pPr>
+        <w:pStyle w:val="Textoindependiente"/>
+        <w:spacing w:line="360" w:lineRule="auto"/>
+      </w:pPr>
+      <w:r>
+        <w:rPr>
+          <w:noProof/>
+        </w:rPr>
+        <w:drawing>
+          <wp:inline distT="0" distB="0" distL="0" distR="0" wp14:anchorId="72AFB026" wp14:editId="01853075">
+            <wp:extent cx="6404610" cy="2073275"/>
+            <wp:effectExtent l="0" t="0" r="0" b="3175"/>
+            <wp:docPr id="618745387" name="Imagen 1"/>
+            <wp:cNvGraphicFramePr>
+              <a:graphicFrameLocks xmlns:a="http://schemas.openxmlformats.org/drawingml/2006/main" noChangeAspect="1"/>
+            </wp:cNvGraphicFramePr>
+            <a:graphic xmlns:a="http://schemas.openxmlformats.org/drawingml/2006/main">
+              <a:graphicData uri="http://schemas.openxmlformats.org/drawingml/2006/picture">
+                <pic:pic xmlns:pic="http://schemas.openxmlformats.org/drawingml/2006/picture">
+                  <pic:nvPicPr>
+                    <pic:cNvPr id="618745387" name="Imagen 618745387"/>
+                    <pic:cNvPicPr/>
+                  </pic:nvPicPr>
+                  <pic:blipFill>
+                    <a:blip r:embed="rId16">
+                      <a:extLst>
+                        <a:ext uri="{28A0092B-C50C-407E-A947-70E740481C1C}">
+                          <a14:useLocalDpi xmlns:a14="http://schemas.microsoft.com/office/drawing/2010/main" val="0"/>
+                        </a:ext>
+                      </a:extLst>
+                    </a:blip>
+                    <a:stretch>
+                      <a:fillRect/>
+                    </a:stretch>
+                  </pic:blipFill>
+                  <pic:spPr>
+                    <a:xfrm>
+                      <a:off x="0" y="0"/>
+                      <a:ext cx="6404610" cy="2073275"/>
+                    </a:xfrm>
+                    <a:prstGeom prst="rect">
+                      <a:avLst/>
+                    </a:prstGeom>
+                  </pic:spPr>
+                </pic:pic>
+              </a:graphicData>
+            </a:graphic>
+          </wp:inline>
+        </w:drawing>
+      </w:r>
+    </w:p>
+    <w:p>
+      <w:pPr>
+        <w:pStyle w:val="Textoindependiente"/>
+        <w:spacing w:before="10"/>
+        <w:ind w:left="120"/>
+      </w:pPr>
+    </w:p>
+    <w:p>
+      <w:pPr>
+        <w:pStyle w:val="Textoindependiente"/>
+        <w:spacing w:before="10"/>
+        <w:ind w:left="120"/>
+      </w:pPr>
+    </w:p>
+    <w:p>
+      <w:pPr>
+        <w:pStyle w:val="Ttulo3"/>
+        <w:jc w:val="both"/>
+      </w:pPr>
+      <w:r>
+        <w:rPr>
+          <w:color w:val="313B54"/>
+          <w:spacing w:val="-4"/>
+        </w:rPr>
         <w:t>Reglas del sistema</w:t>
       </w:r>
     </w:p>
@@ -3259,7 +3416,13 @@
         <w:t>jefe a cargo</w:t>
       </w:r>
       <w:r>
-        <w:t xml:space="preserve"> es responsable de aprobar o rechazar los reportes de tiempo enviados por los empleados a su cargo.</w:t>
+        <w:t xml:space="preserve"> es responsable de aprobar o rechazar los reportes de tiempo enviados por los</w:t>
+      </w:r>
+      <w:r>
+        <w:t xml:space="preserve"> colaboradores</w:t>
+      </w:r>
+      <w:r>
+        <w:t xml:space="preserve"> a su cargo.</w:t>
       </w:r>
     </w:p>
     <w:p>
@@ -3431,7 +3594,7 @@
                     </pic:cNvPicPr>
                   </pic:nvPicPr>
                   <pic:blipFill>
-                    <a:blip r:embed="rId16">
+                    <a:blip r:embed="rId17">
                       <a:extLst>
                         <a:ext uri="{28A0092B-C50C-407E-A947-70E740481C1C}">
                           <a14:useLocalDpi xmlns:a14="http://schemas.microsoft.com/office/drawing/2010/main" val="0"/>
@@ -4726,163 +4889,66 @@
           <w:color w:val="313B54"/>
         </w:rPr>
         <w:lastRenderedPageBreak/>
-        <w:t>Validar un Reporte</w:t>
-      </w:r>
-    </w:p>
-    <w:p>
-      <w:pPr>
-        <w:pStyle w:val="Textoindependiente"/>
-      </w:pPr>
-    </w:p>
-    <w:p>
-      <w:pPr>
-        <w:pStyle w:val="Prrafodelista"/>
-        <w:numPr>
-          <w:ilvl w:val="0"/>
-          <w:numId w:val="3"/>
-        </w:numPr>
-        <w:spacing w:line="360" w:lineRule="auto"/>
-      </w:pPr>
-      <w:r>
-        <w:rPr>
-          <w:sz w:val="20"/>
-        </w:rPr>
-        <w:t>Abre el reporte que deseas aprobar desde la tabla de pendientes.</w:t>
-      </w:r>
-    </w:p>
-    <w:p>
-      <w:pPr>
-        <w:pStyle w:val="Prrafodelista"/>
-        <w:numPr>
-          <w:ilvl w:val="0"/>
-          <w:numId w:val="3"/>
-        </w:numPr>
-        <w:spacing w:line="360" w:lineRule="auto"/>
-      </w:pPr>
-      <w:r>
-        <w:rPr>
-          <w:sz w:val="20"/>
-        </w:rPr>
-        <w:t>Revisa que todos los registros de tiempo estén correctos.</w:t>
-      </w:r>
-    </w:p>
-    <w:p>
-      <w:pPr>
-        <w:pStyle w:val="Prrafodelista"/>
-        <w:numPr>
-          <w:ilvl w:val="0"/>
-          <w:numId w:val="3"/>
-        </w:numPr>
-        <w:spacing w:line="360" w:lineRule="auto"/>
-      </w:pPr>
-      <w:r>
-        <w:rPr>
-          <w:sz w:val="20"/>
-        </w:rPr>
-        <w:t>Haz clic en el botón "</w:t>
-      </w:r>
-      <w:r>
-        <w:rPr>
-          <w:b/>
-          <w:bCs/>
-          <w:sz w:val="20"/>
-        </w:rPr>
-        <w:t>Aprobar</w:t>
-      </w:r>
-      <w:r>
-        <w:rPr>
-          <w:sz w:val="20"/>
-        </w:rPr>
-        <w:t>" (en verde).</w:t>
-      </w:r>
-    </w:p>
-    <w:p>
-      <w:pPr>
-        <w:pStyle w:val="Prrafodelista"/>
-        <w:numPr>
-          <w:ilvl w:val="0"/>
-          <w:numId w:val="3"/>
-        </w:numPr>
-        <w:spacing w:line="360" w:lineRule="auto"/>
-        <w:rPr>
-          <w:sz w:val="20"/>
-          <w:szCs w:val="20"/>
-        </w:rPr>
-      </w:pPr>
-      <w:r>
-        <w:rPr>
-          <w:sz w:val="20"/>
-          <w:szCs w:val="20"/>
-        </w:rPr>
-        <w:t xml:space="preserve">Confirma la acción en la ventana de confirmación. </w:t>
-      </w:r>
-    </w:p>
-    <w:p>
-      <w:pPr>
-        <w:pStyle w:val="Prrafodelista"/>
-        <w:numPr>
-          <w:ilvl w:val="0"/>
-          <w:numId w:val="3"/>
-        </w:numPr>
-        <w:spacing w:line="360" w:lineRule="auto"/>
-        <w:rPr>
-          <w:sz w:val="20"/>
-          <w:szCs w:val="20"/>
-        </w:rPr>
-      </w:pPr>
-      <w:r>
-        <w:rPr>
-          <w:sz w:val="20"/>
-          <w:szCs w:val="20"/>
-        </w:rPr>
-        <w:t>El estado del reporte cambiará a “</w:t>
-      </w:r>
-      <w:r>
-        <w:rPr>
-          <w:b/>
-          <w:bCs/>
-          <w:sz w:val="20"/>
-          <w:szCs w:val="20"/>
-        </w:rPr>
-        <w:t>Aprobado</w:t>
-      </w:r>
-      <w:r>
-        <w:rPr>
-          <w:sz w:val="20"/>
-          <w:szCs w:val="20"/>
-        </w:rPr>
-        <w:t>” y el empleado recibirá una notificación.</w:t>
-      </w:r>
-    </w:p>
-    <w:p>
-      <w:pPr>
-        <w:pStyle w:val="Prrafodelista"/>
-        <w:spacing w:line="360" w:lineRule="auto"/>
-        <w:ind w:left="342" w:firstLine="0"/>
-        <w:rPr>
-          <w:sz w:val="20"/>
-          <w:szCs w:val="20"/>
-        </w:rPr>
-      </w:pPr>
-    </w:p>
-    <w:p>
-      <w:pPr>
-        <w:spacing w:line="360" w:lineRule="auto"/>
-        <w:ind w:left="119"/>
-        <w:rPr>
-          <w:sz w:val="20"/>
-          <w:szCs w:val="20"/>
+        <w:t>Valida</w:t>
+      </w:r>
+      <w:r>
+        <w:rPr>
+          <w:color w:val="313B54"/>
+        </w:rPr>
+        <w:t>ción</w:t>
+      </w:r>
+    </w:p>
+    <w:p>
+      <w:pPr>
+        <w:spacing w:before="240" w:line="360" w:lineRule="auto"/>
+        <w:ind w:firstLine="119"/>
+      </w:pPr>
+      <w:r>
+        <w:rPr>
+          <w:sz w:val="20"/>
+        </w:rPr>
+        <w:t>En esta pantalla podrás visualizar todos los reportes pendientes por revisión</w:t>
+      </w:r>
+      <w:r>
+        <w:rPr>
+          <w:sz w:val="20"/>
+        </w:rPr>
+        <w:t xml:space="preserve"> organizados por fecha</w:t>
+      </w:r>
+      <w:r>
+        <w:rPr>
+          <w:sz w:val="20"/>
+        </w:rPr>
+        <w:t>.</w:t>
+      </w:r>
+    </w:p>
+    <w:p>
+      <w:pPr>
+        <w:pStyle w:val="Ttulo3"/>
+        <w:jc w:val="both"/>
+        <w:rPr>
+          <w:color w:val="313B54"/>
+        </w:rPr>
+      </w:pPr>
+    </w:p>
+    <w:p>
+      <w:pPr>
+        <w:pStyle w:val="Ttulo3"/>
+        <w:jc w:val="both"/>
+        <w:rPr>
+          <w:color w:val="313B54"/>
         </w:rPr>
       </w:pPr>
       <w:r>
         <w:rPr>
           <w:noProof/>
+          <w:color w:val="313B54"/>
         </w:rPr>
         <w:drawing>
-          <wp:inline distT="0" distB="0" distL="0" distR="0" wp14:anchorId="7B96D199" wp14:editId="77AEA833">
-            <wp:extent cx="6404610" cy="1191895"/>
-            <wp:effectExtent l="0" t="0" r="0" b="8255"/>
-            <wp:docPr id="720373564" name="Imagen 9"/>
+          <wp:inline distT="0" distB="0" distL="0" distR="0" wp14:anchorId="771E3012" wp14:editId="2D998295">
+            <wp:extent cx="6404610" cy="2557145"/>
+            <wp:effectExtent l="0" t="0" r="0" b="0"/>
+            <wp:docPr id="1259708126" name="Imagen 1"/>
             <wp:cNvGraphicFramePr>
               <a:graphicFrameLocks xmlns:a="http://schemas.openxmlformats.org/drawingml/2006/main" noChangeAspect="1"/>
             </wp:cNvGraphicFramePr>
@@ -4890,13 +4956,644 @@
               <a:graphicData uri="http://schemas.openxmlformats.org/drawingml/2006/picture">
                 <pic:pic xmlns:pic="http://schemas.openxmlformats.org/drawingml/2006/picture">
                   <pic:nvPicPr>
-                    <pic:cNvPr id="0" name="Picture 17"/>
+                    <pic:cNvPr id="1259708126" name="Imagen 1259708126"/>
+                    <pic:cNvPicPr/>
+                  </pic:nvPicPr>
+                  <pic:blipFill>
+                    <a:blip r:embed="rId18">
+                      <a:extLst>
+                        <a:ext uri="{28A0092B-C50C-407E-A947-70E740481C1C}">
+                          <a14:useLocalDpi xmlns:a14="http://schemas.microsoft.com/office/drawing/2010/main" val="0"/>
+                        </a:ext>
+                      </a:extLst>
+                    </a:blip>
+                    <a:stretch>
+                      <a:fillRect/>
+                    </a:stretch>
+                  </pic:blipFill>
+                  <pic:spPr>
+                    <a:xfrm>
+                      <a:off x="0" y="0"/>
+                      <a:ext cx="6404610" cy="2557145"/>
+                    </a:xfrm>
+                    <a:prstGeom prst="rect">
+                      <a:avLst/>
+                    </a:prstGeom>
+                  </pic:spPr>
+                </pic:pic>
+              </a:graphicData>
+            </a:graphic>
+          </wp:inline>
+        </w:drawing>
+      </w:r>
+    </w:p>
+    <w:p>
+      <w:pPr>
+        <w:pStyle w:val="Ttulo3"/>
+        <w:jc w:val="both"/>
+        <w:rPr>
+          <w:color w:val="313B54"/>
+        </w:rPr>
+      </w:pPr>
+    </w:p>
+    <w:p>
+      <w:pPr>
+        <w:pStyle w:val="Ttulo3"/>
+        <w:jc w:val="both"/>
+      </w:pPr>
+      <w:r>
+        <w:rPr>
+          <w:color w:val="313B54"/>
+        </w:rPr>
+        <w:t>Validar un Reporte</w:t>
+      </w:r>
+    </w:p>
+    <w:p>
+      <w:pPr>
+        <w:pStyle w:val="Textoindependiente"/>
+      </w:pPr>
+    </w:p>
+    <w:p>
+      <w:pPr>
+        <w:pStyle w:val="Prrafodelista"/>
+        <w:numPr>
+          <w:ilvl w:val="0"/>
+          <w:numId w:val="3"/>
+        </w:numPr>
+        <w:spacing w:line="360" w:lineRule="auto"/>
+      </w:pPr>
+      <w:r>
+        <w:rPr>
+          <w:sz w:val="20"/>
+        </w:rPr>
+        <w:t>Selecciona una fecha que aun tenga reportes pendientes por validar</w:t>
+      </w:r>
+      <w:r>
+        <w:rPr>
+          <w:sz w:val="20"/>
+        </w:rPr>
+        <w:t>.</w:t>
+      </w:r>
+    </w:p>
+    <w:p>
+      <w:pPr>
+        <w:pStyle w:val="Prrafodelista"/>
+        <w:numPr>
+          <w:ilvl w:val="0"/>
+          <w:numId w:val="3"/>
+        </w:numPr>
+        <w:spacing w:line="360" w:lineRule="auto"/>
+      </w:pPr>
+      <w:r>
+        <w:rPr>
+          <w:sz w:val="20"/>
+        </w:rPr>
+        <w:t>Podrás visualizar todos los colaboradores que tengan reportes pendientes de esa fecha y el estado de sus reportes.</w:t>
+      </w:r>
+    </w:p>
+    <w:p>
+      <w:pPr>
+        <w:pStyle w:val="Prrafodelista"/>
+        <w:numPr>
+          <w:ilvl w:val="0"/>
+          <w:numId w:val="3"/>
+        </w:numPr>
+        <w:spacing w:line="360" w:lineRule="auto"/>
+      </w:pPr>
+      <w:r>
+        <w:rPr>
+          <w:sz w:val="20"/>
+        </w:rPr>
+        <w:t>Selecciona a un colaborador y r</w:t>
+      </w:r>
+      <w:r>
+        <w:rPr>
+          <w:sz w:val="20"/>
+        </w:rPr>
+        <w:t>evisa que todos los registros de tiempo estén correctos.</w:t>
+      </w:r>
+    </w:p>
+    <w:p>
+      <w:pPr>
+        <w:pStyle w:val="Prrafodelista"/>
+        <w:numPr>
+          <w:ilvl w:val="0"/>
+          <w:numId w:val="3"/>
+        </w:numPr>
+        <w:spacing w:line="360" w:lineRule="auto"/>
+      </w:pPr>
+      <w:r>
+        <w:rPr>
+          <w:sz w:val="20"/>
+        </w:rPr>
+        <w:t>Haz clic en el botón "</w:t>
+      </w:r>
+      <w:r>
+        <w:rPr>
+          <w:b/>
+          <w:bCs/>
+          <w:sz w:val="20"/>
+        </w:rPr>
+        <w:t>Aprobar</w:t>
+      </w:r>
+      <w:r>
+        <w:rPr>
+          <w:sz w:val="20"/>
+        </w:rPr>
+        <w:t>" (en verde).</w:t>
+      </w:r>
+    </w:p>
+    <w:p>
+      <w:pPr>
+        <w:pStyle w:val="Prrafodelista"/>
+        <w:numPr>
+          <w:ilvl w:val="0"/>
+          <w:numId w:val="3"/>
+        </w:numPr>
+        <w:spacing w:line="360" w:lineRule="auto"/>
+        <w:rPr>
+          <w:sz w:val="20"/>
+          <w:szCs w:val="20"/>
+        </w:rPr>
+      </w:pPr>
+      <w:r>
+        <w:rPr>
+          <w:sz w:val="20"/>
+          <w:szCs w:val="20"/>
+        </w:rPr>
+        <w:t xml:space="preserve">Confirma la acción en la ventana de confirmación. </w:t>
+      </w:r>
+    </w:p>
+    <w:p>
+      <w:pPr>
+        <w:pStyle w:val="Prrafodelista"/>
+        <w:numPr>
+          <w:ilvl w:val="0"/>
+          <w:numId w:val="3"/>
+        </w:numPr>
+        <w:spacing w:line="360" w:lineRule="auto"/>
+        <w:rPr>
+          <w:sz w:val="20"/>
+          <w:szCs w:val="20"/>
+        </w:rPr>
+      </w:pPr>
+      <w:r>
+        <w:rPr>
+          <w:sz w:val="20"/>
+          <w:szCs w:val="20"/>
+        </w:rPr>
+        <w:t>El estado del reporte cambiará a “</w:t>
+      </w:r>
+      <w:r>
+        <w:rPr>
+          <w:b/>
+          <w:bCs/>
+          <w:sz w:val="20"/>
+          <w:szCs w:val="20"/>
+        </w:rPr>
+        <w:t>Aprobado</w:t>
+      </w:r>
+      <w:r>
+        <w:rPr>
+          <w:sz w:val="20"/>
+          <w:szCs w:val="20"/>
+        </w:rPr>
+        <w:t>” y el empleado recibirá una notificación.</w:t>
+      </w:r>
+    </w:p>
+    <w:p>
+      <w:pPr>
+        <w:pStyle w:val="Prrafodelista"/>
+        <w:spacing w:line="360" w:lineRule="auto"/>
+        <w:ind w:left="342" w:firstLine="0"/>
+        <w:rPr>
+          <w:sz w:val="20"/>
+          <w:szCs w:val="20"/>
+        </w:rPr>
+      </w:pPr>
+    </w:p>
+    <w:p>
+      <w:pPr>
+        <w:spacing w:line="360" w:lineRule="auto"/>
+        <w:ind w:left="119"/>
+        <w:rPr>
+          <w:sz w:val="20"/>
+          <w:szCs w:val="20"/>
+        </w:rPr>
+      </w:pPr>
+      <w:r>
+        <w:rPr>
+          <w:noProof/>
+          <w:sz w:val="20"/>
+          <w:szCs w:val="20"/>
+        </w:rPr>
+        <w:drawing>
+          <wp:inline distT="0" distB="0" distL="0" distR="0" wp14:anchorId="3D59FC65" wp14:editId="28D26C4D">
+            <wp:extent cx="6404610" cy="2592705"/>
+            <wp:effectExtent l="0" t="0" r="0" b="0"/>
+            <wp:docPr id="1794352317" name="Imagen 2"/>
+            <wp:cNvGraphicFramePr>
+              <a:graphicFrameLocks xmlns:a="http://schemas.openxmlformats.org/drawingml/2006/main" noChangeAspect="1"/>
+            </wp:cNvGraphicFramePr>
+            <a:graphic xmlns:a="http://schemas.openxmlformats.org/drawingml/2006/main">
+              <a:graphicData uri="http://schemas.openxmlformats.org/drawingml/2006/picture">
+                <pic:pic xmlns:pic="http://schemas.openxmlformats.org/drawingml/2006/picture">
+                  <pic:nvPicPr>
+                    <pic:cNvPr id="1794352317" name="Imagen 1794352317"/>
+                    <pic:cNvPicPr/>
+                  </pic:nvPicPr>
+                  <pic:blipFill>
+                    <a:blip r:embed="rId19">
+                      <a:extLst>
+                        <a:ext uri="{28A0092B-C50C-407E-A947-70E740481C1C}">
+                          <a14:useLocalDpi xmlns:a14="http://schemas.microsoft.com/office/drawing/2010/main" val="0"/>
+                        </a:ext>
+                      </a:extLst>
+                    </a:blip>
+                    <a:stretch>
+                      <a:fillRect/>
+                    </a:stretch>
+                  </pic:blipFill>
+                  <pic:spPr>
+                    <a:xfrm>
+                      <a:off x="0" y="0"/>
+                      <a:ext cx="6404610" cy="2592705"/>
+                    </a:xfrm>
+                    <a:prstGeom prst="rect">
+                      <a:avLst/>
+                    </a:prstGeom>
+                  </pic:spPr>
+                </pic:pic>
+              </a:graphicData>
+            </a:graphic>
+          </wp:inline>
+        </w:drawing>
+      </w:r>
+    </w:p>
+    <w:p>
+      <w:pPr>
+        <w:spacing w:line="360" w:lineRule="auto"/>
+        <w:ind w:left="119"/>
+        <w:rPr>
+          <w:sz w:val="20"/>
+          <w:szCs w:val="20"/>
+        </w:rPr>
+      </w:pPr>
+    </w:p>
+    <w:p>
+      <w:pPr>
+        <w:pStyle w:val="Textoindependiente"/>
+        <w:shd w:val="clear" w:color="auto" w:fill="E2EFDA"/>
+        <w:spacing w:before="100" w:after="100" w:line="247" w:lineRule="exact"/>
+        <w:ind w:left="200" w:right="200"/>
+        <w:jc w:val="both"/>
+      </w:pPr>
+      <w:r>
+        <w:rPr>
+          <w:b/>
+          <w:bCs/>
+          <w:color w:val="375623"/>
+        </w:rPr>
+        <w:t xml:space="preserve">Recomendación: </w:t>
+      </w:r>
+      <w:r>
+        <w:rPr>
+          <w:i/>
+          <w:iCs/>
+        </w:rPr>
+        <w:t>Revisa con detenimiento cada registro antes de aprobar, especialmente las horas asignadas a proyectos de clientes.</w:t>
+      </w:r>
+    </w:p>
+    <w:p>
+      <w:pPr>
+        <w:pStyle w:val="Textoindependiente"/>
+        <w:spacing w:before="121"/>
+      </w:pPr>
+    </w:p>
+    <w:p>
+      <w:pPr>
+        <w:pStyle w:val="Ttulo3"/>
+        <w:jc w:val="both"/>
+      </w:pPr>
+      <w:r>
+        <w:rPr>
+          <w:color w:val="313B54"/>
+        </w:rPr>
+        <w:lastRenderedPageBreak/>
+        <w:t>Rechazar un Reporte</w:t>
+      </w:r>
+    </w:p>
+    <w:p>
+      <w:pPr>
+        <w:pStyle w:val="Textoindependiente"/>
+      </w:pPr>
+    </w:p>
+    <w:p>
+      <w:pPr>
+        <w:pStyle w:val="Prrafodelista"/>
+        <w:numPr>
+          <w:ilvl w:val="0"/>
+          <w:numId w:val="3"/>
+        </w:numPr>
+        <w:spacing w:line="360" w:lineRule="auto"/>
+      </w:pPr>
+      <w:r>
+        <w:rPr>
+          <w:sz w:val="20"/>
+        </w:rPr>
+        <w:t>Abre el reporte que deseas rechazar.</w:t>
+      </w:r>
+    </w:p>
+    <w:p>
+      <w:pPr>
+        <w:pStyle w:val="Prrafodelista"/>
+        <w:numPr>
+          <w:ilvl w:val="0"/>
+          <w:numId w:val="3"/>
+        </w:numPr>
+        <w:spacing w:line="360" w:lineRule="auto"/>
+      </w:pPr>
+      <w:r>
+        <w:rPr>
+          <w:sz w:val="20"/>
+        </w:rPr>
+        <w:t>Identifica los registros con problemas.</w:t>
+      </w:r>
+    </w:p>
+    <w:p>
+      <w:pPr>
+        <w:pStyle w:val="Prrafodelista"/>
+        <w:numPr>
+          <w:ilvl w:val="0"/>
+          <w:numId w:val="3"/>
+        </w:numPr>
+        <w:spacing w:line="360" w:lineRule="auto"/>
+      </w:pPr>
+      <w:r>
+        <w:rPr>
+          <w:sz w:val="20"/>
+        </w:rPr>
+        <w:t>Haz clic en el botón "</w:t>
+      </w:r>
+      <w:r>
+        <w:rPr>
+          <w:b/>
+          <w:bCs/>
+          <w:sz w:val="20"/>
+        </w:rPr>
+        <w:t>Rechazar</w:t>
+      </w:r>
+      <w:r>
+        <w:rPr>
+          <w:sz w:val="20"/>
+        </w:rPr>
+        <w:t>" (en rojo).</w:t>
+      </w:r>
+    </w:p>
+    <w:p>
+      <w:pPr>
+        <w:pStyle w:val="Prrafodelista"/>
+        <w:numPr>
+          <w:ilvl w:val="0"/>
+          <w:numId w:val="3"/>
+        </w:numPr>
+        <w:spacing w:line="360" w:lineRule="auto"/>
+      </w:pPr>
+      <w:r>
+        <w:rPr>
+          <w:sz w:val="20"/>
+        </w:rPr>
+        <w:t xml:space="preserve">Se abrirá un campo de texto donde debes escribir el </w:t>
+      </w:r>
+      <w:r>
+        <w:rPr>
+          <w:sz w:val="20"/>
+        </w:rPr>
+        <w:t>motivo del rechazo</w:t>
+      </w:r>
+      <w:r>
+        <w:rPr>
+          <w:sz w:val="20"/>
+        </w:rPr>
+        <w:t xml:space="preserve"> o las correcciones requeridas.</w:t>
+      </w:r>
+    </w:p>
+    <w:p>
+      <w:pPr>
+        <w:pStyle w:val="Prrafodelista"/>
+        <w:numPr>
+          <w:ilvl w:val="0"/>
+          <w:numId w:val="3"/>
+        </w:numPr>
+        <w:spacing w:line="360" w:lineRule="auto"/>
+      </w:pPr>
+      <w:r>
+        <w:rPr>
+          <w:sz w:val="20"/>
+        </w:rPr>
+        <w:t>Haz clic en "</w:t>
+      </w:r>
+      <w:r>
+        <w:rPr>
+          <w:b/>
+          <w:bCs/>
+          <w:sz w:val="20"/>
+        </w:rPr>
+        <w:t>Confirmar rechazo</w:t>
+      </w:r>
+      <w:r>
+        <w:rPr>
+          <w:sz w:val="20"/>
+        </w:rPr>
+        <w:t>". El empleado recibirá una notificación con tus comentarios.</w:t>
+      </w:r>
+    </w:p>
+    <w:p>
+      <w:pPr>
+        <w:spacing w:line="360" w:lineRule="auto"/>
+      </w:pPr>
+    </w:p>
+    <w:p>
+      <w:pPr>
+        <w:spacing w:line="360" w:lineRule="auto"/>
+      </w:pPr>
+      <w:r>
+        <w:rPr>
+          <w:noProof/>
+        </w:rPr>
+        <w:drawing>
+          <wp:inline distT="0" distB="0" distL="0" distR="0" wp14:anchorId="38505B64" wp14:editId="2FFB9BB6">
+            <wp:extent cx="6404610" cy="1942465"/>
+            <wp:effectExtent l="0" t="0" r="0" b="635"/>
+            <wp:docPr id="324720148" name="Imagen 3"/>
+            <wp:cNvGraphicFramePr>
+              <a:graphicFrameLocks xmlns:a="http://schemas.openxmlformats.org/drawingml/2006/main" noChangeAspect="1"/>
+            </wp:cNvGraphicFramePr>
+            <a:graphic xmlns:a="http://schemas.openxmlformats.org/drawingml/2006/main">
+              <a:graphicData uri="http://schemas.openxmlformats.org/drawingml/2006/picture">
+                <pic:pic xmlns:pic="http://schemas.openxmlformats.org/drawingml/2006/picture">
+                  <pic:nvPicPr>
+                    <pic:cNvPr id="324720148" name="Imagen 324720148"/>
+                    <pic:cNvPicPr/>
+                  </pic:nvPicPr>
+                  <pic:blipFill>
+                    <a:blip r:embed="rId20">
+                      <a:extLst>
+                        <a:ext uri="{28A0092B-C50C-407E-A947-70E740481C1C}">
+                          <a14:useLocalDpi xmlns:a14="http://schemas.microsoft.com/office/drawing/2010/main" val="0"/>
+                        </a:ext>
+                      </a:extLst>
+                    </a:blip>
+                    <a:stretch>
+                      <a:fillRect/>
+                    </a:stretch>
+                  </pic:blipFill>
+                  <pic:spPr>
+                    <a:xfrm>
+                      <a:off x="0" y="0"/>
+                      <a:ext cx="6404610" cy="1942465"/>
+                    </a:xfrm>
+                    <a:prstGeom prst="rect">
+                      <a:avLst/>
+                    </a:prstGeom>
+                  </pic:spPr>
+                </pic:pic>
+              </a:graphicData>
+            </a:graphic>
+          </wp:inline>
+        </w:drawing>
+      </w:r>
+    </w:p>
+    <w:p>
+      <w:pPr>
+        <w:spacing w:line="360" w:lineRule="auto"/>
+      </w:pPr>
+    </w:p>
+    <w:p>
+      <w:pPr>
+        <w:pStyle w:val="Textoindependiente"/>
+        <w:shd w:val="clear" w:color="auto" w:fill="E2EFDA"/>
+        <w:spacing w:before="100" w:after="100" w:line="247" w:lineRule="exact"/>
+        <w:ind w:left="200" w:right="200"/>
+        <w:jc w:val="both"/>
+      </w:pPr>
+      <w:r>
+        <w:rPr>
+          <w:b/>
+          <w:bCs/>
+          <w:color w:val="375623"/>
+        </w:rPr>
+        <w:t xml:space="preserve">Recordatorio: </w:t>
+      </w:r>
+      <w:r>
+        <w:rPr>
+          <w:i/>
+          <w:iCs/>
+        </w:rPr>
+        <w:t>Puedes consultar el historial de registros del día en curso de cada empleado a tu cargo haciendo clic sobre su nombre. También puedes aplicar filtros de fecha para ver el historial completo de un determinado periodo.</w:t>
+      </w:r>
+    </w:p>
+    <w:p>
+      <w:pPr>
+        <w:rPr>
+          <w:sz w:val="20"/>
+          <w:szCs w:val="20"/>
+        </w:rPr>
+      </w:pPr>
+      <w:r>
+        <w:br w:type="page"/>
+      </w:r>
+    </w:p>
+    <w:p>
+      <w:pPr>
+        <w:pStyle w:val="Ttulo3"/>
+        <w:jc w:val="both"/>
+      </w:pPr>
+      <w:r>
+        <w:rPr>
+          <w:color w:val="313B54"/>
+          <w:spacing w:val="-4"/>
+        </w:rPr>
+        <w:lastRenderedPageBreak/>
+        <w:t>Historial de registros</w:t>
+      </w:r>
+      <w:r>
+        <w:t xml:space="preserve"> </w:t>
+      </w:r>
+    </w:p>
+    <w:p>
+      <w:pPr>
+        <w:pStyle w:val="Textoindependiente"/>
+        <w:numPr>
+          <w:ilvl w:val="0"/>
+          <w:numId w:val="18"/>
+        </w:numPr>
+        <w:spacing w:before="240" w:line="360" w:lineRule="auto"/>
+      </w:pPr>
+      <w:r>
+        <w:t>Se muestra un listado de registros realizados.</w:t>
+      </w:r>
+    </w:p>
+    <w:p>
+      <w:pPr>
+        <w:pStyle w:val="Textoindependiente"/>
+        <w:numPr>
+          <w:ilvl w:val="0"/>
+          <w:numId w:val="18"/>
+        </w:numPr>
+        <w:spacing w:line="360" w:lineRule="auto"/>
+      </w:pPr>
+      <w:r>
+        <w:t>Incluye tipo, fecha y comentarios.</w:t>
+      </w:r>
+    </w:p>
+    <w:p>
+      <w:pPr>
+        <w:pStyle w:val="Textoindependiente"/>
+        <w:numPr>
+          <w:ilvl w:val="0"/>
+          <w:numId w:val="18"/>
+        </w:numPr>
+        <w:spacing w:line="360" w:lineRule="auto"/>
+      </w:pPr>
+      <w:r>
+        <w:t>Permite consulta de registros previos del día seleccionado en el calendario.</w:t>
+      </w:r>
+    </w:p>
+    <w:p>
+      <w:pPr>
+        <w:pStyle w:val="Textoindependiente"/>
+        <w:spacing w:line="360" w:lineRule="auto"/>
+      </w:pPr>
+    </w:p>
+    <w:p>
+      <w:pPr>
+        <w:pStyle w:val="Textoindependiente"/>
+        <w:spacing w:line="360" w:lineRule="auto"/>
+      </w:pPr>
+      <w:r>
+        <w:rPr>
+          <w:noProof/>
+        </w:rPr>
+        <w:drawing>
+          <wp:inline distT="0" distB="0" distL="0" distR="0" wp14:anchorId="3FD77D34" wp14:editId="48EAFEBE">
+            <wp:extent cx="6404610" cy="2289175"/>
+            <wp:effectExtent l="0" t="0" r="0" b="0"/>
+            <wp:docPr id="1689946535" name="Imagen 7"/>
+            <wp:cNvGraphicFramePr>
+              <a:graphicFrameLocks xmlns:a="http://schemas.openxmlformats.org/drawingml/2006/main" noChangeAspect="1"/>
+            </wp:cNvGraphicFramePr>
+            <a:graphic xmlns:a="http://schemas.openxmlformats.org/drawingml/2006/main">
+              <a:graphicData uri="http://schemas.openxmlformats.org/drawingml/2006/picture">
+                <pic:pic xmlns:pic="http://schemas.openxmlformats.org/drawingml/2006/picture">
+                  <pic:nvPicPr>
+                    <pic:cNvPr id="0" name="Picture 13"/>
                     <pic:cNvPicPr>
                       <a:picLocks noChangeAspect="1" noChangeArrowheads="1"/>
                     </pic:cNvPicPr>
                   </pic:nvPicPr>
                   <pic:blipFill>
-                    <a:blip r:embed="rId17">
+                    <a:blip r:embed="rId15">
                       <a:extLst>
                         <a:ext uri="{28A0092B-C50C-407E-A947-70E740481C1C}">
                           <a14:useLocalDpi xmlns:a14="http://schemas.microsoft.com/office/drawing/2010/main" val="0"/>
@@ -4911,7 +5608,7 @@
                   <pic:spPr bwMode="auto">
                     <a:xfrm>
                       <a:off x="0" y="0"/>
-                      <a:ext cx="6404610" cy="1191895"/>
+                      <a:ext cx="6404610" cy="2289175"/>
                     </a:xfrm>
                     <a:prstGeom prst="rect">
                       <a:avLst/>
@@ -4930,16 +5627,6 @@
     </w:p>
     <w:p>
       <w:pPr>
-        <w:spacing w:line="360" w:lineRule="auto"/>
-        <w:ind w:left="119"/>
-        <w:rPr>
-          <w:sz w:val="20"/>
-          <w:szCs w:val="20"/>
-        </w:rPr>
-      </w:pPr>
-    </w:p>
-    <w:p>
-      <w:pPr>
         <w:pStyle w:val="Textoindependiente"/>
         <w:shd w:val="clear" w:color="auto" w:fill="E2EFDA"/>
         <w:spacing w:before="100" w:after="100" w:line="247" w:lineRule="exact"/>
@@ -4952,203 +5639,178 @@
           <w:bCs/>
           <w:color w:val="375623"/>
         </w:rPr>
-        <w:t xml:space="preserve">Recomendación: </w:t>
+        <w:t xml:space="preserve">Recordatorio: </w:t>
       </w:r>
       <w:r>
         <w:rPr>
           <w:i/>
           <w:iCs/>
         </w:rPr>
-        <w:t>Revisa con detenimiento cada registro antes de aprobar, especialmente las horas asignadas a proyectos de clientes.</w:t>
-      </w:r>
-    </w:p>
-    <w:p>
-      <w:pPr>
-        <w:pStyle w:val="Textoindependiente"/>
-        <w:spacing w:before="121"/>
-      </w:pPr>
-    </w:p>
-    <w:p>
-      <w:pPr>
-        <w:pStyle w:val="Textoindependiente"/>
-        <w:spacing w:before="121"/>
+        <w:t>Aq</w:t>
+      </w:r>
+      <w:r>
+        <w:rPr>
+          <w:i/>
+          <w:iCs/>
+        </w:rPr>
+        <w:t>uí puede visualizar el estado de todo el historial de registros (registros aprobados, rechazados o pendientes).</w:t>
+      </w:r>
+    </w:p>
+    <w:p>
+      <w:pPr>
+        <w:pStyle w:val="Textoindependiente"/>
+        <w:spacing w:before="10"/>
+        <w:ind w:left="120"/>
       </w:pPr>
     </w:p>
     <w:p>
       <w:pPr>
         <w:pStyle w:val="Ttulo3"/>
+        <w:spacing w:before="240" w:line="360" w:lineRule="auto"/>
         <w:jc w:val="both"/>
-      </w:pPr>
-      <w:r>
         <w:rPr>
           <w:color w:val="313B54"/>
-        </w:rPr>
-        <w:t>Rechazar un Reporte</w:t>
-      </w:r>
-    </w:p>
-    <w:p>
-      <w:pPr>
-        <w:pStyle w:val="Textoindependiente"/>
-      </w:pPr>
-    </w:p>
-    <w:p>
-      <w:pPr>
-        <w:pStyle w:val="Prrafodelista"/>
-        <w:numPr>
-          <w:ilvl w:val="0"/>
-          <w:numId w:val="3"/>
-        </w:numPr>
-        <w:spacing w:line="360" w:lineRule="auto"/>
-      </w:pPr>
-      <w:r>
-        <w:rPr>
-          <w:sz w:val="20"/>
-        </w:rPr>
-        <w:t>Abre el reporte que deseas rechazar.</w:t>
-      </w:r>
-    </w:p>
-    <w:p>
-      <w:pPr>
-        <w:pStyle w:val="Prrafodelista"/>
-        <w:numPr>
-          <w:ilvl w:val="0"/>
-          <w:numId w:val="3"/>
-        </w:numPr>
-        <w:spacing w:line="360" w:lineRule="auto"/>
-      </w:pPr>
-      <w:r>
-        <w:rPr>
-          <w:sz w:val="20"/>
-        </w:rPr>
-        <w:t>Identifica los registros con problemas.</w:t>
-      </w:r>
-    </w:p>
-    <w:p>
-      <w:pPr>
-        <w:pStyle w:val="Prrafodelista"/>
-        <w:numPr>
-          <w:ilvl w:val="0"/>
-          <w:numId w:val="3"/>
-        </w:numPr>
-        <w:spacing w:line="360" w:lineRule="auto"/>
-      </w:pPr>
-      <w:r>
-        <w:rPr>
-          <w:sz w:val="20"/>
-        </w:rPr>
-        <w:t>Haz clic en el botón "</w:t>
+          <w:spacing w:val="-4"/>
+          <w:sz w:val="20"/>
+          <w:szCs w:val="20"/>
+        </w:rPr>
+      </w:pPr>
+      <w:r>
+        <w:rPr>
+          <w:color w:val="313B54"/>
+          <w:spacing w:val="-4"/>
+          <w:sz w:val="20"/>
+          <w:szCs w:val="20"/>
+        </w:rPr>
+        <w:t>Editar un registro</w:t>
+      </w:r>
+    </w:p>
+    <w:p>
+      <w:pPr>
+        <w:pStyle w:val="Textoindependiente"/>
+        <w:numPr>
+          <w:ilvl w:val="0"/>
+          <w:numId w:val="19"/>
+        </w:numPr>
+        <w:spacing w:line="360" w:lineRule="auto"/>
+      </w:pPr>
+      <w:r>
+        <w:t>Puedes editar registros si aún no han sido aprobados o si fueron rechazados.</w:t>
+      </w:r>
+    </w:p>
+    <w:p>
+      <w:pPr>
+        <w:pStyle w:val="Textoindependiente"/>
+        <w:numPr>
+          <w:ilvl w:val="0"/>
+          <w:numId w:val="19"/>
+        </w:numPr>
+        <w:spacing w:line="360" w:lineRule="auto"/>
+      </w:pPr>
+      <w:r>
+        <w:t xml:space="preserve">Para consultarlos puedes dirigirte al </w:t>
       </w:r>
       <w:r>
         <w:rPr>
           <w:b/>
           <w:bCs/>
-          <w:sz w:val="20"/>
-        </w:rPr>
-        <w:t>Rechazar</w:t>
-      </w:r>
-      <w:r>
-        <w:rPr>
-          <w:sz w:val="20"/>
-        </w:rPr>
-        <w:t>" (en rojo).</w:t>
-      </w:r>
-    </w:p>
-    <w:p>
-      <w:pPr>
-        <w:pStyle w:val="Prrafodelista"/>
-        <w:numPr>
-          <w:ilvl w:val="0"/>
-          <w:numId w:val="3"/>
-        </w:numPr>
-        <w:spacing w:line="360" w:lineRule="auto"/>
-      </w:pPr>
-      <w:r>
-        <w:rPr>
-          <w:sz w:val="20"/>
-        </w:rPr>
-        <w:t xml:space="preserve">Se abrirá un campo de texto donde debes escribir el </w:t>
-      </w:r>
-      <w:r>
-        <w:rPr>
-          <w:sz w:val="20"/>
-        </w:rPr>
-        <w:t>motivo del rechazo</w:t>
-      </w:r>
-      <w:r>
-        <w:rPr>
-          <w:sz w:val="20"/>
-        </w:rPr>
-        <w:t xml:space="preserve"> o las correcciones requeridas.</w:t>
-      </w:r>
-    </w:p>
-    <w:p>
-      <w:pPr>
-        <w:pStyle w:val="Prrafodelista"/>
-        <w:numPr>
-          <w:ilvl w:val="0"/>
-          <w:numId w:val="3"/>
-        </w:numPr>
-        <w:spacing w:line="360" w:lineRule="auto"/>
-      </w:pPr>
-      <w:r>
-        <w:rPr>
-          <w:sz w:val="20"/>
-        </w:rPr>
-        <w:t>Haz clic en "</w:t>
-      </w:r>
-      <w:r>
-        <w:rPr>
-          <w:b/>
-          <w:bCs/>
-          <w:sz w:val="20"/>
-        </w:rPr>
-        <w:t>Confirmar rechazo</w:t>
-      </w:r>
-      <w:r>
-        <w:rPr>
-          <w:sz w:val="20"/>
-        </w:rPr>
-        <w:t>". El empleado recibirá una notificación con tus comentarios.</w:t>
-      </w:r>
-    </w:p>
-    <w:p>
-      <w:pPr>
-        <w:spacing w:line="360" w:lineRule="auto"/>
-      </w:pPr>
-    </w:p>
-    <w:p>
-      <w:pPr>
-        <w:pStyle w:val="Textoindependiente"/>
-        <w:shd w:val="clear" w:color="auto" w:fill="E2EFDA"/>
-        <w:spacing w:before="100" w:after="100" w:line="247" w:lineRule="exact"/>
-        <w:ind w:left="200" w:right="200"/>
-        <w:jc w:val="both"/>
-      </w:pPr>
-      <w:r>
-        <w:rPr>
-          <w:b/>
-          <w:bCs/>
-          <w:color w:val="375623"/>
-        </w:rPr>
-        <w:t xml:space="preserve">Recordatorio: </w:t>
-      </w:r>
-      <w:r>
-        <w:rPr>
-          <w:i/>
-          <w:iCs/>
-        </w:rPr>
-        <w:t>Puedes consultar el historial de registros del día en curso de cada empleado a tu cargo haciendo clic sobre su nombre. También puedes aplicar filtros de fecha para ver el historial completo de un determinado periodo.</w:t>
-      </w:r>
-    </w:p>
-    <w:p>
-      <w:pPr>
-        <w:spacing w:line="360" w:lineRule="auto"/>
-      </w:pPr>
-    </w:p>
-    <w:p>
-      <w:pPr>
-        <w:pStyle w:val="Textoindependiente"/>
-        <w:spacing w:before="121"/>
+        </w:rPr>
+        <w:t xml:space="preserve">Historial de Registros </w:t>
+      </w:r>
+      <w:r>
+        <w:t>y filtrar por estado o por fecha.</w:t>
+      </w:r>
+    </w:p>
+    <w:p>
+      <w:pPr>
+        <w:pStyle w:val="Textoindependiente"/>
+        <w:numPr>
+          <w:ilvl w:val="0"/>
+          <w:numId w:val="19"/>
+        </w:numPr>
+        <w:spacing w:line="360" w:lineRule="auto"/>
+      </w:pPr>
+      <w:r>
+        <w:t>Una vez ubicado el registro que se desea editar, presiona el icono azul que está en la esquina superior derecha de este mismo.</w:t>
+      </w:r>
+    </w:p>
+    <w:p>
+      <w:pPr>
+        <w:pStyle w:val="Textoindependiente"/>
+        <w:numPr>
+          <w:ilvl w:val="0"/>
+          <w:numId w:val="19"/>
+        </w:numPr>
+        <w:spacing w:line="360" w:lineRule="auto"/>
+      </w:pPr>
+      <w:r>
+        <w:t>Podrás cambiar todos los elementos, igual que cuando recién haces un registro nuevo.</w:t>
+      </w:r>
+    </w:p>
+    <w:p>
+      <w:pPr>
+        <w:pStyle w:val="Textoindependiente"/>
+        <w:spacing w:line="360" w:lineRule="auto"/>
+        <w:ind w:left="480"/>
+      </w:pPr>
+    </w:p>
+    <w:p>
+      <w:pPr>
+        <w:pStyle w:val="Textoindependiente"/>
+        <w:spacing w:line="360" w:lineRule="auto"/>
+      </w:pPr>
+      <w:r>
+        <w:rPr>
+          <w:noProof/>
+        </w:rPr>
+        <w:drawing>
+          <wp:inline distT="0" distB="0" distL="0" distR="0" wp14:anchorId="7A3BAA78" wp14:editId="5E07A990">
+            <wp:extent cx="6404610" cy="2073275"/>
+            <wp:effectExtent l="0" t="0" r="0" b="3175"/>
+            <wp:docPr id="1782089277" name="Imagen 1"/>
+            <wp:cNvGraphicFramePr>
+              <a:graphicFrameLocks xmlns:a="http://schemas.openxmlformats.org/drawingml/2006/main" noChangeAspect="1"/>
+            </wp:cNvGraphicFramePr>
+            <a:graphic xmlns:a="http://schemas.openxmlformats.org/drawingml/2006/main">
+              <a:graphicData uri="http://schemas.openxmlformats.org/drawingml/2006/picture">
+                <pic:pic xmlns:pic="http://schemas.openxmlformats.org/drawingml/2006/picture">
+                  <pic:nvPicPr>
+                    <pic:cNvPr id="618745387" name="Imagen 618745387"/>
+                    <pic:cNvPicPr/>
+                  </pic:nvPicPr>
+                  <pic:blipFill>
+                    <a:blip r:embed="rId16">
+                      <a:extLst>
+                        <a:ext uri="{28A0092B-C50C-407E-A947-70E740481C1C}">
+                          <a14:useLocalDpi xmlns:a14="http://schemas.microsoft.com/office/drawing/2010/main" val="0"/>
+                        </a:ext>
+                      </a:extLst>
+                    </a:blip>
+                    <a:stretch>
+                      <a:fillRect/>
+                    </a:stretch>
+                  </pic:blipFill>
+                  <pic:spPr>
+                    <a:xfrm>
+                      <a:off x="0" y="0"/>
+                      <a:ext cx="6404610" cy="2073275"/>
+                    </a:xfrm>
+                    <a:prstGeom prst="rect">
+                      <a:avLst/>
+                    </a:prstGeom>
+                  </pic:spPr>
+                </pic:pic>
+              </a:graphicData>
+            </a:graphic>
+          </wp:inline>
+        </w:drawing>
+      </w:r>
+    </w:p>
+    <w:p>
+      <w:pPr>
+        <w:pStyle w:val="Textoindependiente"/>
+        <w:spacing w:before="10"/>
+        <w:ind w:left="120"/>
       </w:pPr>
     </w:p>
     <w:p>
@@ -5380,7 +6042,7 @@
                     </pic:cNvPicPr>
                   </pic:nvPicPr>
                   <pic:blipFill>
-                    <a:blip r:embed="rId18">
+                    <a:blip r:embed="rId21">
                       <a:extLst>
                         <a:ext uri="{28A0092B-C50C-407E-A947-70E740481C1C}">
                           <a14:useLocalDpi xmlns:a14="http://schemas.microsoft.com/office/drawing/2010/main" val="0"/>
@@ -5857,7 +6519,7 @@
                     </pic:cNvPicPr>
                   </pic:nvPicPr>
                   <pic:blipFill>
-                    <a:blip r:embed="rId19">
+                    <a:blip r:embed="rId22">
                       <a:extLst>
                         <a:ext uri="{28A0092B-C50C-407E-A947-70E740481C1C}">
                           <a14:useLocalDpi xmlns:a14="http://schemas.microsoft.com/office/drawing/2010/main" val="0"/>
@@ -6398,7 +7060,7 @@
                     </pic:cNvPicPr>
                   </pic:nvPicPr>
                   <pic:blipFill>
-                    <a:blip r:embed="rId20">
+                    <a:blip r:embed="rId23">
                       <a:extLst>
                         <a:ext uri="{28A0092B-C50C-407E-A947-70E740481C1C}">
                           <a14:useLocalDpi xmlns:a14="http://schemas.microsoft.com/office/drawing/2010/main" val="0"/>
@@ -7025,7 +7687,7 @@
                     </pic:cNvPicPr>
                   </pic:nvPicPr>
                   <pic:blipFill>
-                    <a:blip r:embed="rId21">
+                    <a:blip r:embed="rId24">
                       <a:extLst>
                         <a:ext uri="{28A0092B-C50C-407E-A947-70E740481C1C}">
                           <a14:useLocalDpi xmlns:a14="http://schemas.microsoft.com/office/drawing/2010/main" val="0"/>
@@ -7258,7 +7920,7 @@
                     </pic:cNvPicPr>
                   </pic:nvPicPr>
                   <pic:blipFill>
-                    <a:blip r:embed="rId22">
+                    <a:blip r:embed="rId25">
                       <a:extLst>
                         <a:ext uri="{28A0092B-C50C-407E-A947-70E740481C1C}">
                           <a14:useLocalDpi xmlns:a14="http://schemas.microsoft.com/office/drawing/2010/main" val="0"/>
@@ -7466,10 +8128,7 @@
         <w:ind w:left="120"/>
       </w:pPr>
       <w:r>
-        <w:t xml:space="preserve">R: </w:t>
-      </w:r>
-      <w:r>
-        <w:t>El sistema no tiene un control programado de retardos; por ello, solo calculará tu hora de salida tardía en función del total de horas de una jornada estándar.</w:t>
+        <w:t>R: El sistema no tiene un control programado de retardos; por ello, solo calculará tu hora de salida tardía en función del total de horas de una jornada estándar.</w:t>
       </w:r>
     </w:p>
     <w:p>
@@ -7887,10 +8546,7 @@
         <w:ind w:left="120"/>
       </w:pPr>
       <w:r>
-        <w:t xml:space="preserve">R: </w:t>
-      </w:r>
-      <w:r>
-        <w:t>El sistema relaciona a cada socio con sus proyectos desde que se dan de alta, por lo que no tienes que preocuparte por seleccionarlo. Esto, además de facilitar el registro, evita errores al cargar proyectos al socio equivocado.</w:t>
+        <w:t>R: El sistema relaciona a cada socio con sus proyectos desde que se dan de alta, por lo que no tienes que preocuparte por seleccionarlo. Esto, además de facilitar el registro, evita errores al cargar proyectos al socio equivocado.</w:t>
       </w:r>
     </w:p>
     <w:p>
@@ -7942,10 +8598,7 @@
         <w:jc w:val="both"/>
       </w:pPr>
       <w:r>
-        <w:t xml:space="preserve">R: </w:t>
-      </w:r>
-      <w:r>
-        <w:t>No. Puedes validarlos o rechazarlos con la frecuencia que mejor se adapte a tus tiempos; sin embargo, recuerda que los reportes se irán acumulando y que aquellos que no valides se perderán al final del mes y afectarán a tu equipo.</w:t>
+        <w:t>R: No. Puedes validarlos o rechazarlos con la frecuencia que mejor se adapte a tus tiempos; sin embargo, recuerda que los reportes se irán acumulando y que aquellos que no valides se perderán al final del mes y afectarán a tu equipo.</w:t>
       </w:r>
     </w:p>
     <w:p>
@@ -8304,7 +8957,35 @@
         <w:rPr>
           <w:lang w:val="es-MX"/>
         </w:rPr>
-        <w:t>Recarga la página (Ctrl+R o Cmd+R)</w:t>
+        <w:t>Recarga la página (</w:t>
+      </w:r>
+      <w:proofErr w:type="spellStart"/>
+      <w:r>
+        <w:rPr>
+          <w:lang w:val="es-MX"/>
+        </w:rPr>
+        <w:t>Ctrl+R</w:t>
+      </w:r>
+      <w:proofErr w:type="spellEnd"/>
+      <w:r>
+        <w:rPr>
+          <w:lang w:val="es-MX"/>
+        </w:rPr>
+        <w:t xml:space="preserve"> o </w:t>
+      </w:r>
+      <w:proofErr w:type="spellStart"/>
+      <w:r>
+        <w:rPr>
+          <w:lang w:val="es-MX"/>
+        </w:rPr>
+        <w:t>Cmd+R</w:t>
+      </w:r>
+      <w:proofErr w:type="spellEnd"/>
+      <w:r>
+        <w:rPr>
+          <w:lang w:val="es-MX"/>
+        </w:rPr>
+        <w:t>)</w:t>
       </w:r>
       <w:r>
         <w:rPr>

</xml_diff>